<commit_message>
Documentation Update 20 July
New Documents include: Feedback_Triage Report, Traceability Report, UAT Report & Protocol, Full Commit History and some modifications to the main technical documentation report.
</commit_message>
<xml_diff>
--- a/Documentations/SmartRPD_Documentation.docx
+++ b/Documentations/SmartRPD_Documentation.docx
@@ -6722,7 +6722,6 @@
         <w:t>/caseManagement.js) to browse, search/filter (</w:t>
       </w:r>
       <w:proofErr w:type="spellStart"/>
-      <w:proofErr w:type="gramStart"/>
       <w:r>
         <w:rPr>
           <w:color w:val="auto"/>
@@ -6734,17 +6733,9 @@
         <w:rPr>
           <w:color w:val="auto"/>
         </w:rPr>
-        <w:t>(</w:t>
-      </w:r>
-      <w:proofErr w:type="gramEnd"/>
-      <w:r>
-        <w:rPr>
-          <w:color w:val="auto"/>
-        </w:rPr>
-        <w:t>)) and sort cases, change a case's workflow status inline (</w:t>
+        <w:t>()) and sort cases, change a case's workflow status inline (</w:t>
       </w:r>
       <w:proofErr w:type="spellStart"/>
-      <w:proofErr w:type="gramStart"/>
       <w:r>
         <w:rPr>
           <w:color w:val="auto"/>
@@ -6756,14 +6747,7 @@
         <w:rPr>
           <w:color w:val="auto"/>
         </w:rPr>
-        <w:t>(</w:t>
-      </w:r>
-      <w:proofErr w:type="gramEnd"/>
-      <w:r>
-        <w:rPr>
-          <w:color w:val="auto"/>
-        </w:rPr>
-        <w:t>)), or duplicate/rename/delete/open an existing case.</w:t>
+        <w:t>()), or duplicate/rename/delete/open an existing case.</w:t>
       </w:r>
     </w:p>
     <w:p>
@@ -6853,7 +6837,6 @@
         <w:t xml:space="preserve">, </w:t>
       </w:r>
       <w:proofErr w:type="spellStart"/>
-      <w:proofErr w:type="gramStart"/>
       <w:r>
         <w:rPr>
           <w:color w:val="auto"/>
@@ -6865,14 +6848,7 @@
         <w:rPr>
           <w:color w:val="auto"/>
         </w:rPr>
-        <w:t>(</w:t>
-      </w:r>
-      <w:proofErr w:type="gramEnd"/>
-      <w:r>
-        <w:rPr>
-          <w:color w:val="auto"/>
-        </w:rPr>
-        <w:t>)), and sending invitations.</w:t>
+        <w:t>()), and sending invitations.</w:t>
       </w:r>
     </w:p>
     <w:p>
@@ -6922,7 +6898,6 @@
         <w:t>/dashboard.js) for a production overview: computed process-step progress (</w:t>
       </w:r>
       <w:proofErr w:type="spellStart"/>
-      <w:proofErr w:type="gramStart"/>
       <w:r>
         <w:rPr>
           <w:color w:val="auto"/>
@@ -6934,17 +6909,9 @@
         <w:rPr>
           <w:color w:val="auto"/>
         </w:rPr>
-        <w:t>(</w:t>
-      </w:r>
-      <w:proofErr w:type="gramEnd"/>
-      <w:r>
-        <w:rPr>
-          <w:color w:val="auto"/>
-        </w:rPr>
-        <w:t xml:space="preserve">), </w:t>
+        <w:t xml:space="preserve">(), </w:t>
       </w:r>
       <w:proofErr w:type="spellStart"/>
-      <w:proofErr w:type="gramStart"/>
       <w:r>
         <w:rPr>
           <w:color w:val="auto"/>
@@ -6956,17 +6923,9 @@
         <w:rPr>
           <w:color w:val="auto"/>
         </w:rPr>
-        <w:t>(</w:t>
-      </w:r>
-      <w:proofErr w:type="gramEnd"/>
-      <w:r>
-        <w:rPr>
-          <w:color w:val="auto"/>
-        </w:rPr>
-        <w:t>)), captured views (</w:t>
+        <w:t>()), captured views (</w:t>
       </w:r>
       <w:proofErr w:type="spellStart"/>
-      <w:proofErr w:type="gramStart"/>
       <w:r>
         <w:rPr>
           <w:color w:val="auto"/>
@@ -6978,14 +6937,7 @@
         <w:rPr>
           <w:color w:val="auto"/>
         </w:rPr>
-        <w:t>(</w:t>
-      </w:r>
-      <w:proofErr w:type="gramEnd"/>
-      <w:r>
-        <w:rPr>
-          <w:color w:val="auto"/>
-        </w:rPr>
-        <w:t xml:space="preserve">)), and </w:t>
+        <w:t xml:space="preserve">()), and </w:t>
       </w:r>
       <w:r>
         <w:rPr>
@@ -7000,7 +6952,6 @@
         <w:t xml:space="preserve"> roles, rendered as an overlay (</w:t>
       </w:r>
       <w:proofErr w:type="spellStart"/>
-      <w:proofErr w:type="gramStart"/>
       <w:r>
         <w:rPr>
           <w:color w:val="auto"/>
@@ -7012,14 +6963,7 @@
         <w:rPr>
           <w:color w:val="auto"/>
         </w:rPr>
-        <w:t>(</w:t>
-      </w:r>
-      <w:proofErr w:type="gramEnd"/>
-      <w:r>
-        <w:rPr>
-          <w:color w:val="auto"/>
-        </w:rPr>
-        <w:t>)) without leaving the current workspace.</w:t>
+        <w:t>()) without leaving the current workspace.</w:t>
       </w:r>
     </w:p>
     <w:p>
@@ -7303,7 +7247,6 @@
         <w:t xml:space="preserve">Add STL Files – Within the same workspace, the user can also attach up to four extra reference STL files per case (preview3D.js: </w:t>
       </w:r>
       <w:proofErr w:type="spellStart"/>
-      <w:proofErr w:type="gramStart"/>
       <w:r>
         <w:rPr>
           <w:color w:val="auto"/>
@@ -7315,17 +7258,9 @@
         <w:rPr>
           <w:color w:val="auto"/>
         </w:rPr>
-        <w:t>(</w:t>
-      </w:r>
-      <w:proofErr w:type="gramEnd"/>
-      <w:r>
-        <w:rPr>
-          <w:color w:val="auto"/>
-        </w:rPr>
-        <w:t xml:space="preserve">), </w:t>
+        <w:t xml:space="preserve">(), </w:t>
       </w:r>
       <w:proofErr w:type="spellStart"/>
-      <w:proofErr w:type="gramStart"/>
       <w:r>
         <w:rPr>
           <w:color w:val="auto"/>
@@ -7337,17 +7272,9 @@
         <w:rPr>
           <w:color w:val="auto"/>
         </w:rPr>
-        <w:t>(</w:t>
-      </w:r>
-      <w:proofErr w:type="gramEnd"/>
-      <w:r>
-        <w:rPr>
-          <w:color w:val="auto"/>
-        </w:rPr>
-        <w:t xml:space="preserve">), </w:t>
+        <w:t xml:space="preserve">(), </w:t>
       </w:r>
       <w:proofErr w:type="spellStart"/>
-      <w:proofErr w:type="gramStart"/>
       <w:r>
         <w:rPr>
           <w:color w:val="auto"/>
@@ -7359,17 +7286,9 @@
         <w:rPr>
           <w:color w:val="auto"/>
         </w:rPr>
-        <w:t>(</w:t>
-      </w:r>
-      <w:proofErr w:type="gramEnd"/>
-      <w:r>
-        <w:rPr>
-          <w:color w:val="auto"/>
-        </w:rPr>
-        <w:t xml:space="preserve">), </w:t>
+        <w:t xml:space="preserve">(), </w:t>
       </w:r>
       <w:proofErr w:type="spellStart"/>
-      <w:proofErr w:type="gramStart"/>
       <w:r>
         <w:rPr>
           <w:color w:val="auto"/>
@@ -7381,17 +7300,9 @@
         <w:rPr>
           <w:color w:val="auto"/>
         </w:rPr>
-        <w:t>(</w:t>
-      </w:r>
-      <w:proofErr w:type="gramEnd"/>
-      <w:r>
-        <w:rPr>
-          <w:color w:val="auto"/>
-        </w:rPr>
-        <w:t xml:space="preserve">), </w:t>
+        <w:t xml:space="preserve">(), </w:t>
       </w:r>
       <w:proofErr w:type="spellStart"/>
-      <w:proofErr w:type="gramStart"/>
       <w:r>
         <w:rPr>
           <w:color w:val="auto"/>
@@ -7403,28 +7314,7 @@
         <w:rPr>
           <w:color w:val="auto"/>
         </w:rPr>
-        <w:t>(</w:t>
-      </w:r>
-      <w:proofErr w:type="gramEnd"/>
-      <w:r>
-        <w:rPr>
-          <w:color w:val="auto"/>
-        </w:rPr>
-        <w:t>), stored as jaw_stls_extra_slot_</w:t>
-      </w:r>
-      <w:proofErr w:type="gramStart"/>
-      <w:r>
-        <w:rPr>
-          <w:color w:val="auto"/>
-        </w:rPr>
-        <w:t>1..</w:t>
-      </w:r>
-      <w:proofErr w:type="gramEnd"/>
-      <w:r>
-        <w:rPr>
-          <w:color w:val="auto"/>
-        </w:rPr>
-        <w:t>4), each shown/hidden independently in the embedded 3D preview</w:t>
+        <w:t>(), stored as jaw_stls_extra_slot_1..4), each shown/hidden independently in the embedded 3D preview</w:t>
       </w:r>
       <w:r>
         <w:rPr>
@@ -7458,7 +7348,6 @@
         <w:t>Download / Export / Share — From case management, the user can download a case's raw OFF/STL files directly (</w:t>
       </w:r>
       <w:proofErr w:type="spellStart"/>
-      <w:proofErr w:type="gramStart"/>
       <w:r>
         <w:rPr>
           <w:color w:val="auto"/>
@@ -7470,17 +7359,9 @@
         <w:rPr>
           <w:color w:val="auto"/>
         </w:rPr>
-        <w:t>(</w:t>
-      </w:r>
-      <w:proofErr w:type="gramEnd"/>
-      <w:r>
-        <w:rPr>
-          <w:color w:val="auto"/>
-        </w:rPr>
-        <w:t xml:space="preserve">), </w:t>
+        <w:t xml:space="preserve">(), </w:t>
       </w:r>
       <w:proofErr w:type="spellStart"/>
-      <w:proofErr w:type="gramStart"/>
       <w:r>
         <w:rPr>
           <w:color w:val="auto"/>
@@ -7492,28 +7373,7 @@
         <w:rPr>
           <w:color w:val="auto"/>
         </w:rPr>
-        <w:t>(</w:t>
-      </w:r>
-      <w:proofErr w:type="gramEnd"/>
-      <w:r>
-        <w:rPr>
-          <w:color w:val="auto"/>
-        </w:rPr>
-        <w:t>)</w:t>
-      </w:r>
-      <w:proofErr w:type="gramStart"/>
-      <w:r>
-        <w:rPr>
-          <w:color w:val="auto"/>
-        </w:rPr>
-        <w:t>), or</w:t>
-      </w:r>
-      <w:proofErr w:type="gramEnd"/>
-      <w:r>
-        <w:rPr>
-          <w:color w:val="auto"/>
-        </w:rPr>
-        <w:t xml:space="preserve"> generate a compiled report combining 2D design images and clinical data (noticeboard.js </w:t>
+        <w:t xml:space="preserve">()), or generate a compiled report combining 2D design images and clinical data (noticeboard.js </w:t>
       </w:r>
       <w:proofErr w:type="spellStart"/>
       <w:r>
@@ -7530,7 +7390,6 @@
         <w:t>()/</w:t>
       </w:r>
       <w:proofErr w:type="spellStart"/>
-      <w:proofErr w:type="gramStart"/>
       <w:r>
         <w:rPr>
           <w:color w:val="auto"/>
@@ -7542,17 +7401,9 @@
         <w:rPr>
           <w:color w:val="auto"/>
         </w:rPr>
-        <w:t>(</w:t>
-      </w:r>
-      <w:proofErr w:type="gramEnd"/>
-      <w:r>
-        <w:rPr>
-          <w:color w:val="auto"/>
-        </w:rPr>
-        <w:t xml:space="preserve">), converted to .docx via accessibility.js </w:t>
+        <w:t xml:space="preserve">(), converted to .docx via accessibility.js </w:t>
       </w:r>
       <w:proofErr w:type="spellStart"/>
-      <w:proofErr w:type="gramStart"/>
       <w:r>
         <w:rPr>
           <w:color w:val="auto"/>
@@ -7564,31 +7415,9 @@
         <w:rPr>
           <w:color w:val="auto"/>
         </w:rPr>
-        <w:t>(</w:t>
-      </w:r>
-      <w:proofErr w:type="gramEnd"/>
-      <w:r>
-        <w:rPr>
-          <w:color w:val="auto"/>
-        </w:rPr>
-        <w:t xml:space="preserve">)). Export/Share builds a 3D viewer link under a fixed, shared, non-personal viewer identity (VIEWER_UUID in config.js), with the case ID obfuscated via XOR+Base64 encoding (crypt.js </w:t>
-      </w:r>
-      <w:proofErr w:type="gramStart"/>
-      <w:r>
-        <w:rPr>
-          <w:color w:val="auto"/>
-        </w:rPr>
-        <w:t>lol(</w:t>
-      </w:r>
-      <w:proofErr w:type="gramEnd"/>
-      <w:r>
-        <w:rPr>
-          <w:color w:val="auto"/>
-        </w:rPr>
-        <w:t>)) rather than passed in plain text. Sharing that link as a scannable QR code (</w:t>
+        <w:t>()). Export/Share builds a 3D viewer link under a fixed, shared, non-personal viewer identity (VIEWER_UUID in config.js), with the case ID obfuscated via XOR+Base64 encoding (crypt.js lol()) rather than passed in plain text. Sharing that link as a scannable QR code (</w:t>
       </w:r>
       <w:proofErr w:type="spellStart"/>
-      <w:proofErr w:type="gramStart"/>
       <w:r>
         <w:rPr>
           <w:color w:val="auto"/>
@@ -7600,14 +7429,7 @@
         <w:rPr>
           <w:color w:val="auto"/>
         </w:rPr>
-        <w:t>(</w:t>
-      </w:r>
-      <w:proofErr w:type="gramEnd"/>
-      <w:r>
-        <w:rPr>
-          <w:color w:val="auto"/>
-        </w:rPr>
-        <w:t xml:space="preserve">), </w:t>
+        <w:t xml:space="preserve">(), </w:t>
       </w:r>
       <w:proofErr w:type="spellStart"/>
       <w:r>
@@ -8307,7 +8129,6 @@
               <w:t>caseManagement.js handles filtering (</w:t>
             </w:r>
             <w:proofErr w:type="spellStart"/>
-            <w:proofErr w:type="gramStart"/>
             <w:r>
               <w:rPr>
                 <w:color w:val="auto"/>
@@ -8323,19 +8144,9 @@
                 <w:sz w:val="20"/>
                 <w:szCs w:val="20"/>
               </w:rPr>
-              <w:t>(</w:t>
-            </w:r>
-            <w:proofErr w:type="gramEnd"/>
-            <w:r>
-              <w:rPr>
-                <w:color w:val="auto"/>
-                <w:sz w:val="20"/>
-                <w:szCs w:val="20"/>
-              </w:rPr>
-              <w:t>)), sorting, status changes (</w:t>
+              <w:t>()), sorting, status changes (</w:t>
             </w:r>
             <w:proofErr w:type="spellStart"/>
-            <w:proofErr w:type="gramStart"/>
             <w:r>
               <w:rPr>
                 <w:color w:val="auto"/>
@@ -8351,16 +8162,7 @@
                 <w:sz w:val="20"/>
                 <w:szCs w:val="20"/>
               </w:rPr>
-              <w:t>(</w:t>
-            </w:r>
-            <w:proofErr w:type="gramEnd"/>
-            <w:r>
-              <w:rPr>
-                <w:color w:val="auto"/>
-                <w:sz w:val="20"/>
-                <w:szCs w:val="20"/>
-              </w:rPr>
-              <w:t>)), duplicate/rename/delete; </w:t>
+              <w:t>()), duplicate/rename/delete; </w:t>
             </w:r>
             <w:proofErr w:type="spellStart"/>
             <w:r>
@@ -9122,7 +8924,6 @@
               <w:t>Mobile/tablet/desktop layout switching (</w:t>
             </w:r>
             <w:proofErr w:type="spellStart"/>
-            <w:proofErr w:type="gramStart"/>
             <w:r>
               <w:rPr>
                 <w:color w:val="auto"/>
@@ -9138,16 +8939,7 @@
                 <w:sz w:val="20"/>
                 <w:szCs w:val="20"/>
               </w:rPr>
-              <w:t>(</w:t>
-            </w:r>
-            <w:proofErr w:type="gramEnd"/>
-            <w:r>
-              <w:rPr>
-                <w:color w:val="auto"/>
-                <w:sz w:val="20"/>
-                <w:szCs w:val="20"/>
-              </w:rPr>
-              <w:t>)) present in control.js, index.js, ThreeDMobile.js</w:t>
+              <w:t>()) present in control.js, index.js, ThreeDMobile.js</w:t>
             </w:r>
           </w:p>
         </w:tc>
@@ -9388,7 +9180,6 @@
               </w:rPr>
             </w:pPr>
             <w:proofErr w:type="spellStart"/>
-            <w:proofErr w:type="gramStart"/>
             <w:r>
               <w:rPr>
                 <w:color w:val="auto"/>
@@ -9404,16 +9195,7 @@
                 <w:sz w:val="20"/>
                 <w:szCs w:val="20"/>
               </w:rPr>
-              <w:t>(</w:t>
-            </w:r>
-            <w:proofErr w:type="gramEnd"/>
-            <w:r>
-              <w:rPr>
-                <w:color w:val="auto"/>
-                <w:sz w:val="20"/>
-                <w:szCs w:val="20"/>
-              </w:rPr>
-              <w:t>) in caseManagement.js (with </w:t>
+              <w:t>() in caseManagement.js (with </w:t>
             </w:r>
             <w:proofErr w:type="spellStart"/>
             <w:r>
@@ -9645,15 +9427,7 @@
         <w:spacing w:line="360" w:lineRule="auto"/>
       </w:pPr>
       <w:r>
-        <w:t xml:space="preserve">2DAnnotation.js — entry point for the workspace; also hosts shared annotation state and UI helpers so other modules can import from a single place. Feature modules are loaded via dynamic </w:t>
-      </w:r>
-      <w:proofErr w:type="gramStart"/>
-      <w:r>
-        <w:t>import(</w:t>
-      </w:r>
-      <w:proofErr w:type="gramEnd"/>
-      <w:r>
-        <w:t xml:space="preserve">) during </w:t>
+        <w:t xml:space="preserve">2DAnnotation.js — entry point for the workspace; also hosts shared annotation state and UI helpers so other modules can import from a single place. Feature modules are loaded via dynamic import() during </w:t>
       </w:r>
       <w:proofErr w:type="spellStart"/>
       <w:r>
@@ -9984,55 +9758,7 @@
           <w:rFonts w:eastAsia="Times New Roman"/>
           <w:color w:val="auto"/>
         </w:rPr>
-        <w:t xml:space="preserve"> options per tab/section (</w:t>
-      </w:r>
-      <w:proofErr w:type="gramStart"/>
-      <w:r>
-        <w:rPr>
-          <w:rFonts w:eastAsia="Times New Roman"/>
-          <w:color w:val="auto"/>
-        </w:rPr>
-        <w:t>initComponentCatalog(</w:t>
-      </w:r>
-      <w:proofErr w:type="gramEnd"/>
-      <w:r>
-        <w:rPr>
-          <w:rFonts w:eastAsia="Times New Roman"/>
-          <w:color w:val="auto"/>
-        </w:rPr>
-        <w:t>), </w:t>
-      </w:r>
-      <w:proofErr w:type="gramStart"/>
-      <w:r>
-        <w:rPr>
-          <w:rFonts w:eastAsia="Times New Roman"/>
-          <w:color w:val="auto"/>
-        </w:rPr>
-        <w:t>renderComponentCatalog(</w:t>
-      </w:r>
-      <w:proofErr w:type="gramEnd"/>
-      <w:r>
-        <w:rPr>
-          <w:rFonts w:eastAsia="Times New Roman"/>
-          <w:color w:val="auto"/>
-        </w:rPr>
-        <w:t>), </w:t>
-      </w:r>
-      <w:proofErr w:type="gramStart"/>
-      <w:r>
-        <w:rPr>
-          <w:rFonts w:eastAsia="Times New Roman"/>
-          <w:color w:val="auto"/>
-        </w:rPr>
-        <w:t>createComponentItemButton(</w:t>
-      </w:r>
-      <w:proofErr w:type="gramEnd"/>
-      <w:r>
-        <w:rPr>
-          <w:rFonts w:eastAsia="Times New Roman"/>
-          <w:color w:val="auto"/>
-        </w:rPr>
-        <w:t>)).</w:t>
+        <w:t xml:space="preserve"> options per tab/section (initComponentCatalog(), renderComponentCatalog(), createComponentItemButton()).</w:t>
       </w:r>
     </w:p>
     <w:p>
@@ -10121,7 +9847,6 @@
         <w:t>&lt;filter&gt; def and referenced via </w:t>
       </w:r>
       <w:proofErr w:type="spellStart"/>
-      <w:proofErr w:type="gramStart"/>
       <w:r>
         <w:rPr>
           <w:rFonts w:eastAsia="Times New Roman"/>
@@ -10135,15 +9860,7 @@
           <w:rFonts w:eastAsia="Times New Roman"/>
           <w:color w:val="auto"/>
         </w:rPr>
-        <w:t>(</w:t>
-      </w:r>
-      <w:proofErr w:type="gramEnd"/>
-      <w:r>
-        <w:rPr>
-          <w:rFonts w:eastAsia="Times New Roman"/>
-          <w:color w:val="auto"/>
-        </w:rPr>
-        <w:t>#tint-...).</w:t>
+        <w:t>(#tint-...).</w:t>
       </w:r>
     </w:p>
     <w:p>
@@ -10260,7 +9977,6 @@
         <w:t>criteria.js — validates whether a selected component can legally be placed on a given tooth, returning a structured failure reason + conflicting components when it can't (</w:t>
       </w:r>
       <w:proofErr w:type="spellStart"/>
-      <w:proofErr w:type="gramStart"/>
       <w:r>
         <w:rPr>
           <w:rFonts w:eastAsia="Times New Roman"/>
@@ -10274,15 +9990,7 @@
           <w:rFonts w:eastAsia="Times New Roman"/>
           <w:color w:val="auto"/>
         </w:rPr>
-        <w:t>(</w:t>
-      </w:r>
-      <w:proofErr w:type="gramEnd"/>
-      <w:r>
-        <w:rPr>
-          <w:rFonts w:eastAsia="Times New Roman"/>
-          <w:color w:val="auto"/>
-        </w:rPr>
-        <w:t>)).</w:t>
+        <w:t>()).</w:t>
       </w:r>
     </w:p>
     <w:p>
@@ -10305,7 +10013,6 @@
         <w:t>toothUtils.js — a single small helper, </w:t>
       </w:r>
       <w:proofErr w:type="spellStart"/>
-      <w:proofErr w:type="gramStart"/>
       <w:r>
         <w:rPr>
           <w:rFonts w:eastAsia="Times New Roman"/>
@@ -10319,15 +10026,7 @@
           <w:rFonts w:eastAsia="Times New Roman"/>
           <w:color w:val="auto"/>
         </w:rPr>
-        <w:t>(</w:t>
-      </w:r>
-      <w:proofErr w:type="gramEnd"/>
-      <w:r>
-        <w:rPr>
-          <w:rFonts w:eastAsia="Times New Roman"/>
-          <w:color w:val="auto"/>
-        </w:rPr>
-        <w:t>), that folds "occlusal" into "lingual" for surface-key consistency.</w:t>
+        <w:t>(), that folds "occlusal" into "lingual" for surface-key consistency.</w:t>
       </w:r>
     </w:p>
     <w:p>
@@ -10420,7 +10119,6 @@
         <w:t>noticeboard.js — pulls together case detail, captured jaw images (</w:t>
       </w:r>
       <w:proofErr w:type="spellStart"/>
-      <w:proofErr w:type="gramStart"/>
       <w:r>
         <w:rPr>
           <w:rFonts w:eastAsia="Times New Roman"/>
@@ -10434,31 +10132,7 @@
           <w:rFonts w:eastAsia="Times New Roman"/>
           <w:color w:val="auto"/>
         </w:rPr>
-        <w:t>(</w:t>
-      </w:r>
-      <w:proofErr w:type="gramEnd"/>
-      <w:r>
-        <w:rPr>
-          <w:rFonts w:eastAsia="Times New Roman"/>
-          <w:color w:val="auto"/>
-        </w:rPr>
-        <w:t>) from annotationLocks.js), instruction-editor output, and 3D preview captures (capture3</w:t>
-      </w:r>
-      <w:proofErr w:type="gramStart"/>
-      <w:r>
-        <w:rPr>
-          <w:rFonts w:eastAsia="Times New Roman"/>
-          <w:color w:val="auto"/>
-        </w:rPr>
-        <w:t>DPreviewDataUrl(</w:t>
-      </w:r>
-      <w:proofErr w:type="gramEnd"/>
-      <w:r>
-        <w:rPr>
-          <w:rFonts w:eastAsia="Times New Roman"/>
-          <w:color w:val="auto"/>
-        </w:rPr>
-        <w:t>) from preview3D.js) into the case report/noticeboard content.</w:t>
+        <w:t>() from annotationLocks.js), instruction-editor output, and 3D preview captures (capture3DPreviewDataUrl() from preview3D.js) into the case report/noticeboard content.</w:t>
       </w:r>
     </w:p>
     <w:p>
@@ -10955,7 +10629,6 @@
               <w:t>newControls.js (</w:t>
             </w:r>
             <w:proofErr w:type="spellStart"/>
-            <w:proofErr w:type="gramStart"/>
             <w:r>
               <w:rPr>
                 <w:color w:val="auto"/>
@@ -10971,16 +10644,7 @@
                 <w:sz w:val="20"/>
                 <w:szCs w:val="20"/>
               </w:rPr>
-              <w:t>(</w:t>
-            </w:r>
-            <w:proofErr w:type="gramEnd"/>
-            <w:r>
-              <w:rPr>
-                <w:color w:val="auto"/>
-                <w:sz w:val="20"/>
-                <w:szCs w:val="20"/>
-              </w:rPr>
-              <w:t>))</w:t>
+              <w:t>())</w:t>
             </w:r>
           </w:p>
         </w:tc>
@@ -11059,7 +10723,6 @@
               <w:t>resetButton.js (</w:t>
             </w:r>
             <w:proofErr w:type="spellStart"/>
-            <w:proofErr w:type="gramStart"/>
             <w:r>
               <w:rPr>
                 <w:color w:val="auto"/>
@@ -11075,16 +10738,7 @@
                 <w:sz w:val="20"/>
                 <w:szCs w:val="20"/>
               </w:rPr>
-              <w:t>(</w:t>
-            </w:r>
-            <w:proofErr w:type="gramEnd"/>
-            <w:r>
-              <w:rPr>
-                <w:color w:val="auto"/>
-                <w:sz w:val="20"/>
-                <w:szCs w:val="20"/>
-              </w:rPr>
-              <w:t>))</w:t>
+              <w:t>())</w:t>
             </w:r>
           </w:p>
         </w:tc>
@@ -11200,7 +10854,6 @@
               <w:t>Provides the viewer footer (case name, logged-in user, connectivity status), the right-hand navigation drawer (</w:t>
             </w:r>
             <w:proofErr w:type="spellStart"/>
-            <w:proofErr w:type="gramStart"/>
             <w:r>
               <w:rPr>
                 <w:color w:val="auto"/>
@@ -11216,19 +10869,9 @@
                 <w:sz w:val="20"/>
                 <w:szCs w:val="20"/>
               </w:rPr>
-              <w:t>(</w:t>
-            </w:r>
-            <w:proofErr w:type="gramEnd"/>
-            <w:r>
-              <w:rPr>
-                <w:color w:val="auto"/>
-                <w:sz w:val="20"/>
-                <w:szCs w:val="20"/>
-              </w:rPr>
-              <w:t>)), chat entry (</w:t>
+              <w:t>()), chat entry (</w:t>
             </w:r>
             <w:proofErr w:type="spellStart"/>
-            <w:proofErr w:type="gramStart"/>
             <w:r>
               <w:rPr>
                 <w:color w:val="auto"/>
@@ -11244,19 +10887,9 @@
                 <w:sz w:val="20"/>
                 <w:szCs w:val="20"/>
               </w:rPr>
-              <w:t>(</w:t>
-            </w:r>
-            <w:proofErr w:type="gramEnd"/>
-            <w:r>
-              <w:rPr>
-                <w:color w:val="auto"/>
-                <w:sz w:val="20"/>
-                <w:szCs w:val="20"/>
-              </w:rPr>
-              <w:t>)), a notes popup (</w:t>
+              <w:t>()), a notes popup (</w:t>
             </w:r>
             <w:proofErr w:type="spellStart"/>
-            <w:proofErr w:type="gramStart"/>
             <w:r>
               <w:rPr>
                 <w:color w:val="auto"/>
@@ -11272,16 +10905,7 @@
                 <w:sz w:val="20"/>
                 <w:szCs w:val="20"/>
               </w:rPr>
-              <w:t>(</w:t>
-            </w:r>
-            <w:proofErr w:type="gramEnd"/>
-            <w:r>
-              <w:rPr>
-                <w:color w:val="auto"/>
-                <w:sz w:val="20"/>
-                <w:szCs w:val="20"/>
-              </w:rPr>
-              <w:t>)), and sidebar links back to version history and the case list.</w:t>
+              <w:t>()), and sidebar links back to version history and the case list.</w:t>
             </w:r>
           </w:p>
         </w:tc>
@@ -11544,7 +11168,6 @@
         <w:t xml:space="preserve">When the embedded preview loads, </w:t>
       </w:r>
       <w:proofErr w:type="spellStart"/>
-      <w:proofErr w:type="gramStart"/>
       <w:r>
         <w:rPr>
           <w:rFonts w:eastAsia="Times New Roman"/>
@@ -11558,15 +11181,7 @@
           <w:rFonts w:eastAsia="Times New Roman"/>
           <w:color w:val="auto"/>
         </w:rPr>
-        <w:t>(</w:t>
-      </w:r>
-      <w:proofErr w:type="gramEnd"/>
-      <w:r>
-        <w:rPr>
-          <w:rFonts w:eastAsia="Times New Roman"/>
-          <w:color w:val="auto"/>
-        </w:rPr>
-        <w:t xml:space="preserve">) shows a modal overlay ("Choose mesh quality") with two options — </w:t>
+        <w:t xml:space="preserve">() shows a modal overlay ("Choose mesh quality") with two options — </w:t>
       </w:r>
       <w:r>
         <w:rPr>
@@ -11656,7 +11271,6 @@
         </w:rPr>
       </w:pPr>
       <w:proofErr w:type="spellStart"/>
-      <w:proofErr w:type="gramStart"/>
       <w:r>
         <w:rPr>
           <w:rFonts w:eastAsia="Times New Roman"/>
@@ -11670,15 +11284,7 @@
           <w:rFonts w:eastAsia="Times New Roman"/>
           <w:color w:val="auto"/>
         </w:rPr>
-        <w:t>(</w:t>
-      </w:r>
-      <w:proofErr w:type="gramEnd"/>
-      <w:r>
-        <w:rPr>
-          <w:rFonts w:eastAsia="Times New Roman"/>
-          <w:color w:val="auto"/>
-        </w:rPr>
-        <w:t xml:space="preserve">) swaps the overlay for a </w:t>
+        <w:t xml:space="preserve">() swaps the overlay for a </w:t>
       </w:r>
       <w:proofErr w:type="spellStart"/>
       <w:r>
@@ -11697,7 +11303,6 @@
         <w:t xml:space="preserve"> progress bar (</w:t>
       </w:r>
       <w:proofErr w:type="spellStart"/>
-      <w:proofErr w:type="gramStart"/>
       <w:r>
         <w:rPr>
           <w:rFonts w:eastAsia="Times New Roman"/>
@@ -11711,15 +11316,7 @@
           <w:rFonts w:eastAsia="Times New Roman"/>
           <w:color w:val="auto"/>
         </w:rPr>
-        <w:t>(</w:t>
-      </w:r>
-      <w:proofErr w:type="gramEnd"/>
-      <w:r>
-        <w:rPr>
-          <w:rFonts w:eastAsia="Times New Roman"/>
-          <w:color w:val="auto"/>
-        </w:rPr>
-        <w:t xml:space="preserve">percent, </w:t>
+        <w:t xml:space="preserve">(percent, </w:t>
       </w:r>
       <w:proofErr w:type="spellStart"/>
       <w:r>
@@ -11738,7 +11335,6 @@
         <w:t xml:space="preserve">)), driven by </w:t>
       </w:r>
       <w:proofErr w:type="spellStart"/>
-      <w:proofErr w:type="gramStart"/>
       <w:r>
         <w:rPr>
           <w:rFonts w:eastAsia="Times New Roman"/>
@@ -11752,18 +11348,9 @@
           <w:rFonts w:eastAsia="Times New Roman"/>
           <w:color w:val="auto"/>
         </w:rPr>
-        <w:t>(</w:t>
-      </w:r>
-      <w:proofErr w:type="gramEnd"/>
-      <w:r>
-        <w:rPr>
-          <w:rFonts w:eastAsia="Times New Roman"/>
-          <w:color w:val="auto"/>
-        </w:rPr>
-        <w:t xml:space="preserve">) as each jaw parses — surfacing stage text like "Parsing Upper jaw" or "Matching undercut vertices Lower jaw" mapped across an 8%–94% range — before </w:t>
+        <w:t xml:space="preserve">() as each jaw parses — surfacing stage text like "Parsing Upper jaw" or "Matching undercut vertices Lower jaw" mapped across an 8%–94% range — before </w:t>
       </w:r>
       <w:proofErr w:type="spellStart"/>
-      <w:proofErr w:type="gramStart"/>
       <w:r>
         <w:rPr>
           <w:rFonts w:eastAsia="Times New Roman"/>
@@ -11777,15 +11364,7 @@
           <w:rFonts w:eastAsia="Times New Roman"/>
           <w:color w:val="auto"/>
         </w:rPr>
-        <w:t>(</w:t>
-      </w:r>
-      <w:proofErr w:type="gramEnd"/>
-      <w:r>
-        <w:rPr>
-          <w:rFonts w:eastAsia="Times New Roman"/>
-          <w:color w:val="auto"/>
-        </w:rPr>
-        <w:t>) sets it to 100% ("3D jaw mesh ready") and clears the overlay.</w:t>
+        <w:t>() sets it to 100% ("3D jaw mesh ready") and clears the overlay.</w:t>
       </w:r>
       <w:r>
         <w:rPr>
@@ -11865,7 +11444,6 @@
         <w:t> (</w:t>
       </w:r>
       <w:proofErr w:type="spellStart"/>
-      <w:proofErr w:type="gramStart"/>
       <w:r>
         <w:rPr>
           <w:rFonts w:eastAsia="Times New Roman"/>
@@ -11879,15 +11457,7 @@
           <w:rFonts w:eastAsia="Times New Roman"/>
           <w:color w:val="auto"/>
         </w:rPr>
-        <w:t>(</w:t>
-      </w:r>
-      <w:proofErr w:type="gramEnd"/>
-      <w:r>
-        <w:rPr>
-          <w:rFonts w:eastAsia="Times New Roman"/>
-          <w:color w:val="auto"/>
-        </w:rPr>
-        <w:t>)): decimation is skipped entirely</w:t>
+        <w:t>()): decimation is skipped entirely</w:t>
       </w:r>
       <w:r>
         <w:rPr>
@@ -11926,7 +11496,6 @@
         <w:t> (</w:t>
       </w:r>
       <w:proofErr w:type="spellStart"/>
-      <w:proofErr w:type="gramStart"/>
       <w:r>
         <w:rPr>
           <w:rFonts w:eastAsia="Times New Roman"/>
@@ -11940,15 +11509,7 @@
           <w:rFonts w:eastAsia="Times New Roman"/>
           <w:color w:val="auto"/>
         </w:rPr>
-        <w:t>(</w:t>
-      </w:r>
-      <w:proofErr w:type="gramEnd"/>
-      <w:r>
-        <w:rPr>
-          <w:rFonts w:eastAsia="Times New Roman"/>
-          <w:color w:val="auto"/>
-        </w:rPr>
-        <w:t xml:space="preserve">)): only triggers if the source mesh exceeds PREVIEW_MIN_SIMPLIFY_TRIANGLES (160,000 triangles) — smaller meshes render </w:t>
+        <w:t xml:space="preserve">()): only triggers if the source mesh exceeds PREVIEW_MIN_SIMPLIFY_TRIANGLES (160,000 triangles) — smaller meshes render </w:t>
       </w:r>
       <w:proofErr w:type="spellStart"/>
       <w:r>
@@ -11974,7 +11535,6 @@
         <w:t xml:space="preserve"> </w:t>
       </w:r>
       <w:proofErr w:type="spellStart"/>
-      <w:proofErr w:type="gramStart"/>
       <w:r>
         <w:rPr>
           <w:rFonts w:eastAsia="Times New Roman"/>
@@ -11988,15 +11548,7 @@
           <w:rFonts w:eastAsia="Times New Roman"/>
           <w:color w:val="auto"/>
         </w:rPr>
-        <w:t>(</w:t>
-      </w:r>
-      <w:proofErr w:type="gramEnd"/>
-      <w:r>
-        <w:rPr>
-          <w:rFonts w:eastAsia="Times New Roman"/>
-          <w:color w:val="auto"/>
-        </w:rPr>
-        <w:t>) performs spatial vertex clustering: it buckets nearby vertices into grid cells sized off the mesh's bounding box, merges each cluster to its average position/</w:t>
+        <w:t>() performs spatial vertex clustering: it buckets nearby vertices into grid cells sized off the mesh's bounding box, merges each cluster to its average position/</w:t>
       </w:r>
       <w:proofErr w:type="spellStart"/>
       <w:r>
@@ -12130,7 +11682,6 @@
         <w:t xml:space="preserve"> A small HD/SD badge (</w:t>
       </w:r>
       <w:proofErr w:type="spellStart"/>
-      <w:proofErr w:type="gramStart"/>
       <w:r>
         <w:rPr>
           <w:rFonts w:eastAsia="Times New Roman"/>
@@ -12144,15 +11695,7 @@
           <w:rFonts w:eastAsia="Times New Roman"/>
           <w:color w:val="auto"/>
         </w:rPr>
-        <w:t>(</w:t>
-      </w:r>
-      <w:proofErr w:type="gramEnd"/>
-      <w:r>
-        <w:rPr>
-          <w:rFonts w:eastAsia="Times New Roman"/>
-          <w:color w:val="auto"/>
-        </w:rPr>
-        <w:t xml:space="preserve">)) stays visible after the initial load, letting the user re-render the </w:t>
+        <w:t xml:space="preserve">()) stays visible after the initial load, letting the user re-render the </w:t>
       </w:r>
       <w:r>
         <w:rPr>
@@ -12171,7 +11714,6 @@
         <w:t xml:space="preserve"> jaws at the other quality without a page reload (</w:t>
       </w:r>
       <w:proofErr w:type="spellStart"/>
-      <w:proofErr w:type="gramStart"/>
       <w:r>
         <w:rPr>
           <w:rFonts w:eastAsia="Times New Roman"/>
@@ -12185,18 +11727,9 @@
           <w:rFonts w:eastAsia="Times New Roman"/>
           <w:color w:val="auto"/>
         </w:rPr>
-        <w:t>(</w:t>
-      </w:r>
-      <w:proofErr w:type="gramEnd"/>
-      <w:r>
-        <w:rPr>
-          <w:rFonts w:eastAsia="Times New Roman"/>
-          <w:color w:val="auto"/>
-        </w:rPr>
-        <w:t>)) — it reuses the same progress overlay and reattaches any extra-STL-slot meshes afterward, since repopulating the jaw preview clears and rebuilds the model root. The logic is shared uniformly across both mesh source paths — OFF/parameterized (</w:t>
+        <w:t>()) — it reuses the same progress overlay and reattaches any extra-STL-slot meshes afterward, since repopulating the jaw preview clears and rebuilds the model root. The logic is shared uniformly across both mesh source paths — OFF/parameterized (</w:t>
       </w:r>
       <w:proofErr w:type="spellStart"/>
-      <w:proofErr w:type="gramStart"/>
       <w:r>
         <w:rPr>
           <w:rFonts w:eastAsia="Times New Roman"/>
@@ -12210,18 +11743,9 @@
           <w:rFonts w:eastAsia="Times New Roman"/>
           <w:color w:val="auto"/>
         </w:rPr>
-        <w:t>(</w:t>
-      </w:r>
-      <w:proofErr w:type="gramEnd"/>
-      <w:r>
-        <w:rPr>
-          <w:rFonts w:eastAsia="Times New Roman"/>
-          <w:color w:val="auto"/>
-        </w:rPr>
-        <w:t>)) and STL (</w:t>
+        <w:t>()) and STL (</w:t>
       </w:r>
       <w:proofErr w:type="spellStart"/>
-      <w:proofErr w:type="gramStart"/>
       <w:r>
         <w:rPr>
           <w:rFonts w:eastAsia="Times New Roman"/>
@@ -12235,15 +11759,7 @@
           <w:rFonts w:eastAsia="Times New Roman"/>
           <w:color w:val="auto"/>
         </w:rPr>
-        <w:t>(</w:t>
-      </w:r>
-      <w:proofErr w:type="gramEnd"/>
-      <w:r>
-        <w:rPr>
-          <w:rFonts w:eastAsia="Times New Roman"/>
-          <w:color w:val="auto"/>
-        </w:rPr>
-        <w:t xml:space="preserve">)) — both accept the resolved </w:t>
+        <w:t xml:space="preserve">()) — both accept the resolved </w:t>
       </w:r>
       <w:proofErr w:type="spellStart"/>
       <w:r>
@@ -12335,7 +11851,6 @@
         <w:t> (POLYLINE_ENDPOINT), normalised across structured and encoded payload variants by </w:t>
       </w:r>
       <w:proofErr w:type="spellStart"/>
-      <w:proofErr w:type="gramStart"/>
       <w:r>
         <w:rPr>
           <w:rFonts w:eastAsia="Times New Roman"/>
@@ -12349,15 +11864,7 @@
           <w:rFonts w:eastAsia="Times New Roman"/>
           <w:color w:val="auto"/>
         </w:rPr>
-        <w:t>(</w:t>
-      </w:r>
-      <w:proofErr w:type="gramEnd"/>
-      <w:r>
-        <w:rPr>
-          <w:rFonts w:eastAsia="Times New Roman"/>
-          <w:color w:val="auto"/>
-        </w:rPr>
-        <w:t>) before rendering — this absorbs backend payload-shape differences into one consistent internal format regardless of how the source data was encoded.</w:t>
+        <w:t>() before rendering — this absorbs backend payload-shape differences into one consistent internal format regardless of how the source data was encoded.</w:t>
       </w:r>
     </w:p>
     <w:p>
@@ -12393,39 +11900,7 @@
           <w:rFonts w:eastAsia="Times New Roman"/>
           <w:color w:val="auto"/>
         </w:rPr>
-        <w:t> between adjacent points (</w:t>
-      </w:r>
-      <w:proofErr w:type="gramStart"/>
-      <w:r>
-        <w:rPr>
-          <w:rFonts w:eastAsia="Times New Roman"/>
-          <w:color w:val="auto"/>
-        </w:rPr>
-        <w:t>createPolylineTubeGeometry(</w:t>
-      </w:r>
-      <w:proofErr w:type="gramEnd"/>
-      <w:r>
-        <w:rPr>
-          <w:rFonts w:eastAsia="Times New Roman"/>
-          <w:color w:val="auto"/>
-        </w:rPr>
-        <w:t>) / </w:t>
-      </w:r>
-      <w:proofErr w:type="gramStart"/>
-      <w:r>
-        <w:rPr>
-          <w:rFonts w:eastAsia="Times New Roman"/>
-          <w:color w:val="auto"/>
-        </w:rPr>
-        <w:t>createPolylineTubeGeometryBetweenPoints(</w:t>
-      </w:r>
-      <w:proofErr w:type="gramEnd"/>
-      <w:r>
-        <w:rPr>
-          <w:rFonts w:eastAsia="Times New Roman"/>
-          <w:color w:val="auto"/>
-        </w:rPr>
-        <w:t>)), with per-component visibility toggles and draggable point handles for interactive editing.</w:t>
+        <w:t> between adjacent points (createPolylineTubeGeometry() / createPolylineTubeGeometryBetweenPoints()), with per-component visibility toggles and draggable point handles for interactive editing.</w:t>
       </w:r>
     </w:p>
     <w:p>
@@ -12440,37 +11915,12 @@
           <w:color w:val="auto"/>
         </w:rPr>
       </w:pPr>
-      <w:proofErr w:type="gramStart"/>
-      <w:r>
-        <w:rPr>
-          <w:rFonts w:eastAsia="Times New Roman"/>
-          <w:color w:val="auto"/>
-        </w:rPr>
-        <w:t>applyJawTransformToPolylineGroup(</w:t>
-      </w:r>
-      <w:proofErr w:type="gramEnd"/>
-      <w:r>
-        <w:rPr>
-          <w:rFonts w:eastAsia="Times New Roman"/>
-          <w:color w:val="auto"/>
-        </w:rPr>
-        <w:t>) and </w:t>
-      </w:r>
-      <w:proofErr w:type="gramStart"/>
-      <w:r>
-        <w:rPr>
-          <w:rFonts w:eastAsia="Times New Roman"/>
-          <w:color w:val="auto"/>
-        </w:rPr>
-        <w:t>getClosestJawPolylineSurfacePoint(</w:t>
-      </w:r>
-      <w:proofErr w:type="gramEnd"/>
-      <w:r>
-        <w:rPr>
-          <w:rFonts w:eastAsia="Times New Roman"/>
-          <w:color w:val="auto"/>
-        </w:rPr>
-        <w:t>) accept a </w:t>
+      <w:r>
+        <w:rPr>
+          <w:rFonts w:eastAsia="Times New Roman"/>
+          <w:color w:val="auto"/>
+        </w:rPr>
+        <w:t>applyJawTransformToPolylineGroup() and getClosestJawPolylineSurfacePoint() accept a </w:t>
       </w:r>
       <w:proofErr w:type="spellStart"/>
       <w:r>
@@ -12489,7 +11939,6 @@
         <w:t> of "jaw-local" or "scene-world", but the renderer doesn't just trust a source flag — it computes the median distance from the polyline points to the jaw surface under both interpretations (</w:t>
       </w:r>
       <w:proofErr w:type="spellStart"/>
-      <w:proofErr w:type="gramStart"/>
       <w:r>
         <w:rPr>
           <w:rFonts w:eastAsia="Times New Roman"/>
@@ -12503,15 +11952,7 @@
           <w:rFonts w:eastAsia="Times New Roman"/>
           <w:color w:val="auto"/>
         </w:rPr>
-        <w:t>(</w:t>
-      </w:r>
-      <w:proofErr w:type="gramEnd"/>
-      <w:r>
-        <w:rPr>
-          <w:rFonts w:eastAsia="Times New Roman"/>
-          <w:color w:val="auto"/>
-        </w:rPr>
-        <w:t xml:space="preserve">points, </w:t>
+        <w:t xml:space="preserve">(points, </w:t>
       </w:r>
       <w:proofErr w:type="spellStart"/>
       <w:r>
@@ -12613,7 +12054,6 @@
         <w:t>/get (distinct from the polyline and jaw-mesh endpoints), decoded via </w:t>
       </w:r>
       <w:proofErr w:type="spellStart"/>
-      <w:proofErr w:type="gramStart"/>
       <w:r>
         <w:rPr>
           <w:rFonts w:eastAsia="Times New Roman"/>
@@ -12627,15 +12067,7 @@
           <w:rFonts w:eastAsia="Times New Roman"/>
           <w:color w:val="auto"/>
         </w:rPr>
-        <w:t>(</w:t>
-      </w:r>
-      <w:proofErr w:type="gramEnd"/>
-      <w:r>
-        <w:rPr>
-          <w:rFonts w:eastAsia="Times New Roman"/>
-          <w:color w:val="auto"/>
-        </w:rPr>
-        <w:t>) into upper/lower </w:t>
+        <w:t>() into upper/lower </w:t>
       </w:r>
       <w:proofErr w:type="spellStart"/>
       <w:r>
@@ -12724,7 +12156,6 @@
         <w:t>/artificialTeeth.js); it does not modify jaw meshes or polylines — it's synced to jaw transforms every frame (</w:t>
       </w:r>
       <w:proofErr w:type="spellStart"/>
-      <w:proofErr w:type="gramStart"/>
       <w:r>
         <w:rPr>
           <w:rFonts w:eastAsia="Times New Roman"/>
@@ -12738,15 +12169,7 @@
           <w:rFonts w:eastAsia="Times New Roman"/>
           <w:color w:val="auto"/>
         </w:rPr>
-        <w:t>(</w:t>
-      </w:r>
-      <w:proofErr w:type="gramEnd"/>
-      <w:r>
-        <w:rPr>
-          <w:rFonts w:eastAsia="Times New Roman"/>
-          <w:color w:val="auto"/>
-        </w:rPr>
-        <w:t>)) but never writes back into the jaw geometry itself.</w:t>
+        <w:t>()) but never writes back into the jaw geometry itself.</w:t>
       </w:r>
     </w:p>
     <w:p>
@@ -12810,7 +12233,6 @@
         <w:t>_ (geometry) as separate keyed structures per tooth (</w:t>
       </w:r>
       <w:proofErr w:type="spellStart"/>
-      <w:proofErr w:type="gramStart"/>
       <w:r>
         <w:rPr>
           <w:rFonts w:eastAsia="Times New Roman"/>
@@ -12824,15 +12246,7 @@
           <w:rFonts w:eastAsia="Times New Roman"/>
           <w:color w:val="auto"/>
         </w:rPr>
-        <w:t>(</w:t>
-      </w:r>
-      <w:proofErr w:type="gramEnd"/>
-      <w:r>
-        <w:rPr>
-          <w:rFonts w:eastAsia="Times New Roman"/>
-          <w:color w:val="auto"/>
-        </w:rPr>
-        <w:t>)), and each rendered tooth mesh tags its own </w:t>
+        <w:t>()), and each rendered tooth mesh tags its own </w:t>
       </w:r>
       <w:proofErr w:type="spellStart"/>
       <w:r>
@@ -12888,15 +12302,7 @@
           <w:color w:val="auto"/>
         </w:rPr>
         <w:lastRenderedPageBreak/>
-        <w:t>(e.g. </w:t>
-      </w:r>
-      <w:proofErr w:type="gramStart"/>
-      <w:r>
-        <w:rPr>
-          <w:rFonts w:eastAsia="Times New Roman"/>
-          <w:color w:val="auto"/>
-        </w:rPr>
-        <w:t>mesh.</w:t>
+        <w:t>(e.g. mesh.</w:t>
       </w:r>
       <w:proofErr w:type="spellStart"/>
       <w:r>
@@ -12915,7 +12321,6 @@
         <w:t>?.source?.</w:t>
       </w:r>
       <w:proofErr w:type="spellStart"/>
-      <w:proofErr w:type="gramEnd"/>
       <w:r>
         <w:rPr>
           <w:rFonts w:eastAsia="Times New Roman"/>
@@ -13063,7 +12468,6 @@
         <w:t>, toggling </w:t>
       </w:r>
       <w:proofErr w:type="spellStart"/>
-      <w:proofErr w:type="gramStart"/>
       <w:r>
         <w:rPr>
           <w:rFonts w:eastAsia="Times New Roman"/>
@@ -13072,7 +12476,6 @@
         <w:t>group.setMode</w:t>
       </w:r>
       <w:proofErr w:type="spellEnd"/>
-      <w:proofErr w:type="gramEnd"/>
       <w:r>
         <w:rPr>
           <w:rFonts w:eastAsia="Times New Roman"/>
@@ -13263,39 +12666,7 @@
           <w:rFonts w:eastAsia="Times New Roman"/>
           <w:color w:val="auto"/>
         </w:rPr>
-        <w:t>Load polylines and artificial teeth in the background, as a single parallel batch (</w:t>
-      </w:r>
-      <w:proofErr w:type="gramStart"/>
-      <w:r>
-        <w:rPr>
-          <w:rFonts w:eastAsia="Times New Roman"/>
-          <w:color w:val="auto"/>
-        </w:rPr>
-        <w:t>fetchAndRenderCaseOverlays(</w:t>
-      </w:r>
-      <w:proofErr w:type="gramEnd"/>
-      <w:r>
-        <w:rPr>
-          <w:rFonts w:eastAsia="Times New Roman"/>
-          <w:color w:val="auto"/>
-        </w:rPr>
-        <w:t>): Promise.all([</w:t>
-      </w:r>
-      <w:proofErr w:type="gramStart"/>
-      <w:r>
-        <w:rPr>
-          <w:rFonts w:eastAsia="Times New Roman"/>
-          <w:color w:val="auto"/>
-        </w:rPr>
-        <w:t>fetchAndRenderPolylines(</w:t>
-      </w:r>
-      <w:proofErr w:type="gramEnd"/>
-      <w:r>
-        <w:rPr>
-          <w:rFonts w:eastAsia="Times New Roman"/>
-          <w:color w:val="auto"/>
-        </w:rPr>
-        <w:t xml:space="preserve">), </w:t>
+        <w:t xml:space="preserve">Load polylines and artificial teeth in the background, as a single parallel batch (fetchAndRenderCaseOverlays(): Promise.all([fetchAndRenderPolylines(), </w:t>
       </w:r>
       <w:proofErr w:type="spellStart"/>
       <w:r>
@@ -13350,7 +12721,6 @@
         <w:t> </w:t>
       </w:r>
       <w:proofErr w:type="spellStart"/>
-      <w:proofErr w:type="gramStart"/>
       <w:r>
         <w:rPr>
           <w:rFonts w:eastAsia="Times New Roman"/>
@@ -13364,47 +12734,7 @@
           <w:rFonts w:eastAsia="Times New Roman"/>
           <w:color w:val="auto"/>
         </w:rPr>
-        <w:t>(</w:t>
-      </w:r>
-      <w:proofErr w:type="gramEnd"/>
-      <w:r>
-        <w:rPr>
-          <w:rFonts w:eastAsia="Times New Roman"/>
-          <w:color w:val="auto"/>
-        </w:rPr>
-        <w:t>) only dynamically </w:t>
-      </w:r>
-      <w:proofErr w:type="gramStart"/>
-      <w:r>
-        <w:rPr>
-          <w:rFonts w:eastAsia="Times New Roman"/>
-          <w:color w:val="auto"/>
-        </w:rPr>
-        <w:t>import(</w:t>
-      </w:r>
-      <w:proofErr w:type="gramEnd"/>
-      <w:r>
-        <w:rPr>
-          <w:rFonts w:eastAsia="Times New Roman"/>
-          <w:color w:val="auto"/>
-        </w:rPr>
-        <w:t xml:space="preserve">)s it the first time the user </w:t>
-      </w:r>
-      <w:proofErr w:type="gramStart"/>
-      <w:r>
-        <w:rPr>
-          <w:rFonts w:eastAsia="Times New Roman"/>
-          <w:color w:val="auto"/>
-        </w:rPr>
-        <w:t>actually clicks</w:t>
-      </w:r>
-      <w:proofErr w:type="gramEnd"/>
-      <w:r>
-        <w:rPr>
-          <w:rFonts w:eastAsia="Times New Roman"/>
-          <w:color w:val="auto"/>
-        </w:rPr>
-        <w:t xml:space="preserve"> the chat button, so a broken or slow chat module can never affect initial scene load.</w:t>
+        <w:t>() only dynamically import()s it the first time the user actually clicks the chat button, so a broken or slow chat module can never affect initial scene load.</w:t>
       </w:r>
     </w:p>
     <w:p>
@@ -13493,7 +12823,6 @@
         <w:t> / </w:t>
       </w:r>
       <w:proofErr w:type="spellStart"/>
-      <w:proofErr w:type="gramStart"/>
       <w:r>
         <w:rPr>
           <w:rFonts w:eastAsia="Times New Roman"/>
@@ -13507,15 +12836,7 @@
           <w:rFonts w:eastAsia="Times New Roman"/>
           <w:color w:val="auto"/>
         </w:rPr>
-        <w:t>(</w:t>
-      </w:r>
-      <w:proofErr w:type="gramEnd"/>
-      <w:r>
-        <w:rPr>
-          <w:rFonts w:eastAsia="Times New Roman"/>
-          <w:color w:val="auto"/>
-        </w:rPr>
-        <w:t>)).</w:t>
+        <w:t>()).</w:t>
       </w:r>
     </w:p>
     <w:p>
@@ -13547,29 +12868,12 @@
         <w:t>: when Content-Length is present, the response body is read via </w:t>
       </w:r>
       <w:proofErr w:type="spellStart"/>
-      <w:proofErr w:type="gramStart"/>
-      <w:r>
-        <w:rPr>
-          <w:rFonts w:eastAsia="Times New Roman"/>
-          <w:color w:val="auto"/>
-        </w:rPr>
-        <w:t>response.body</w:t>
-      </w:r>
-      <w:proofErr w:type="gramEnd"/>
-      <w:r>
-        <w:rPr>
-          <w:rFonts w:eastAsia="Times New Roman"/>
-          <w:color w:val="auto"/>
-        </w:rPr>
-        <w:t>.</w:t>
-      </w:r>
-      <w:proofErr w:type="gramStart"/>
-      <w:r>
-        <w:rPr>
-          <w:rFonts w:eastAsia="Times New Roman"/>
-          <w:color w:val="auto"/>
-        </w:rPr>
-        <w:t>getReader</w:t>
+      <w:r>
+        <w:rPr>
+          <w:rFonts w:eastAsia="Times New Roman"/>
+          <w:color w:val="auto"/>
+        </w:rPr>
+        <w:t>response.body.getReader</w:t>
       </w:r>
       <w:proofErr w:type="spellEnd"/>
       <w:r>
@@ -13577,15 +12881,7 @@
           <w:rFonts w:eastAsia="Times New Roman"/>
           <w:color w:val="auto"/>
         </w:rPr>
-        <w:t>(</w:t>
-      </w:r>
-      <w:proofErr w:type="gramEnd"/>
-      <w:r>
-        <w:rPr>
-          <w:rFonts w:eastAsia="Times New Roman"/>
-          <w:color w:val="auto"/>
-        </w:rPr>
-        <w:t>) into a </w:t>
+        <w:t>() into a </w:t>
       </w:r>
       <w:proofErr w:type="spellStart"/>
       <w:r>
@@ -13633,7 +12929,6 @@
         <w:t>: when Content-Length is absent (chunked transfer encoding — confirmed as the GCP-proxy case in 8.3), it skips the streaming UI entirely and falls straight to </w:t>
       </w:r>
       <w:proofErr w:type="spellStart"/>
-      <w:proofErr w:type="gramStart"/>
       <w:r>
         <w:rPr>
           <w:rFonts w:eastAsia="Times New Roman"/>
@@ -13642,7 +12937,6 @@
         <w:t>response.json</w:t>
       </w:r>
       <w:proofErr w:type="spellEnd"/>
-      <w:proofErr w:type="gramEnd"/>
       <w:r>
         <w:rPr>
           <w:rFonts w:eastAsia="Times New Roman"/>
@@ -13893,7 +13187,6 @@
         <w:t>), and the right-panel toggle (</w:t>
       </w:r>
       <w:proofErr w:type="spellStart"/>
-      <w:proofErr w:type="gramStart"/>
       <w:r>
         <w:rPr>
           <w:rFonts w:eastAsia="Times New Roman"/>
@@ -13907,15 +13200,7 @@
           <w:rFonts w:eastAsia="Times New Roman"/>
           <w:color w:val="auto"/>
         </w:rPr>
-        <w:t>(</w:t>
-      </w:r>
-      <w:proofErr w:type="gramEnd"/>
-      <w:r>
-        <w:rPr>
-          <w:rFonts w:eastAsia="Times New Roman"/>
-          <w:color w:val="auto"/>
-        </w:rPr>
-        <w:t>)).</w:t>
+        <w:t>()).</w:t>
       </w:r>
     </w:p>
     <w:p>
@@ -13989,23 +13274,7 @@
           <w:rFonts w:eastAsia="Times New Roman"/>
           <w:color w:val="auto"/>
         </w:rPr>
-        <w:t xml:space="preserve"> replaced but re-skinned by breakpoint — on tablet (769–1024px) it shrinks to a compact 176px-wide panel pinned near the top-right; on mobile (≤768px) it narrows further to 164px and repositions to sit just above the bottom footer bar (bottom: </w:t>
-      </w:r>
-      <w:proofErr w:type="gramStart"/>
-      <w:r>
-        <w:rPr>
-          <w:rFonts w:eastAsia="Times New Roman"/>
-          <w:color w:val="auto"/>
-        </w:rPr>
-        <w:t>calc(</w:t>
-      </w:r>
-      <w:proofErr w:type="gramEnd"/>
-      <w:r>
-        <w:rPr>
-          <w:rFonts w:eastAsia="Times New Roman"/>
-          <w:color w:val="auto"/>
-        </w:rPr>
-        <w:t>92px + safe-area-inset)) — literally "pinned above the footer," confirming that phrasing precisely.</w:t>
+        <w:t> replaced but re-skinned by breakpoint — on tablet (769–1024px) it shrinks to a compact 176px-wide panel pinned near the top-right; on mobile (≤768px) it narrows further to 164px and repositions to sit just above the bottom footer bar (bottom: calc(92px + safe-area-inset)) — literally "pinned above the footer," confirming that phrasing precisely.</w:t>
       </w:r>
     </w:p>
     <w:p>
@@ -14050,7 +13319,6 @@
         <w:t xml:space="preserve"> </w:t>
       </w:r>
       <w:proofErr w:type="spellStart"/>
-      <w:proofErr w:type="gramStart"/>
       <w:r>
         <w:rPr>
           <w:rFonts w:eastAsia="Times New Roman"/>
@@ -14064,15 +13332,7 @@
           <w:rFonts w:eastAsia="Times New Roman"/>
           <w:color w:val="auto"/>
         </w:rPr>
-        <w:t>(</w:t>
-      </w:r>
-      <w:proofErr w:type="gramEnd"/>
-      <w:r>
-        <w:rPr>
-          <w:rFonts w:eastAsia="Times New Roman"/>
-          <w:color w:val="auto"/>
-        </w:rPr>
-        <w:t>)) and the 2D Annotation page (</w:t>
+        <w:t>()) and the 2D Annotation page (</w:t>
       </w:r>
       <w:proofErr w:type="spellStart"/>
       <w:r>
@@ -14143,7 +13403,6 @@
         <w:t>Text comments and image attachments, with client-side MIME sniffing from the base64 signature (</w:t>
       </w:r>
       <w:proofErr w:type="spellStart"/>
-      <w:proofErr w:type="gramStart"/>
       <w:r>
         <w:rPr>
           <w:rFonts w:eastAsia="Times New Roman"/>
@@ -14157,15 +13416,7 @@
           <w:rFonts w:eastAsia="Times New Roman"/>
           <w:color w:val="auto"/>
         </w:rPr>
-        <w:t>(</w:t>
-      </w:r>
-      <w:proofErr w:type="gramEnd"/>
-      <w:r>
-        <w:rPr>
-          <w:rFonts w:eastAsia="Times New Roman"/>
-          <w:color w:val="auto"/>
-        </w:rPr>
-        <w:t>) — JPEG/PNG/GIF/</w:t>
+        <w:t>() — JPEG/PNG/GIF/</w:t>
       </w:r>
       <w:proofErr w:type="spellStart"/>
       <w:r>
@@ -14240,7 +13491,6 @@
         <w:t>/</w:t>
       </w:r>
       <w:proofErr w:type="spellStart"/>
-      <w:proofErr w:type="gramStart"/>
       <w:r>
         <w:rPr>
           <w:rFonts w:eastAsia="Times New Roman"/>
@@ -14254,15 +13504,7 @@
           <w:rFonts w:eastAsia="Times New Roman"/>
           <w:color w:val="auto"/>
         </w:rPr>
-        <w:t>(</w:t>
-      </w:r>
-      <w:proofErr w:type="gramEnd"/>
-      <w:r>
-        <w:rPr>
-          <w:rFonts w:eastAsia="Times New Roman"/>
-          <w:color w:val="auto"/>
-        </w:rPr>
-        <w:t>)) for new messages, with a lightweight signature check on each poll — if the response signature is just message IDs (cheap) it skips the expensive step of re-</w:t>
+        <w:t>()) for new messages, with a lightweight signature check on each poll — if the response signature is just message IDs (cheap) it skips the expensive step of re-</w:t>
       </w:r>
       <w:r>
         <w:rPr>
@@ -14270,23 +13512,7 @@
           <w:color w:val="auto"/>
         </w:rPr>
         <w:lastRenderedPageBreak/>
-        <w:t xml:space="preserve">parsing every message's inline base64 image, only doing the costly full re-render when new content </w:t>
-      </w:r>
-      <w:proofErr w:type="gramStart"/>
-      <w:r>
-        <w:rPr>
-          <w:rFonts w:eastAsia="Times New Roman"/>
-          <w:color w:val="auto"/>
-        </w:rPr>
-        <w:t>actually appears</w:t>
-      </w:r>
-      <w:proofErr w:type="gramEnd"/>
-      <w:r>
-        <w:rPr>
-          <w:rFonts w:eastAsia="Times New Roman"/>
-          <w:color w:val="auto"/>
-        </w:rPr>
-        <w:t>.</w:t>
+        <w:t>parsing every message's inline base64 image, only doing the costly full re-render when new content actually appears.</w:t>
       </w:r>
     </w:p>
     <w:p>
@@ -14325,7 +13551,6 @@
         <w:t>()/</w:t>
       </w:r>
       <w:proofErr w:type="spellStart"/>
-      <w:proofErr w:type="gramStart"/>
       <w:r>
         <w:rPr>
           <w:rFonts w:eastAsia="Times New Roman"/>
@@ -14339,15 +13564,7 @@
           <w:rFonts w:eastAsia="Times New Roman"/>
           <w:color w:val="auto"/>
         </w:rPr>
-        <w:t>(</w:t>
-      </w:r>
-      <w:proofErr w:type="gramEnd"/>
-      <w:r>
-        <w:rPr>
-          <w:rFonts w:eastAsia="Times New Roman"/>
-          <w:color w:val="auto"/>
-        </w:rPr>
-        <w:t>)) so reopening chat paints instantly from cache before the network fetch resolves.</w:t>
+        <w:t>()) so reopening chat paints instantly from cache before the network fetch resolves.</w:t>
       </w:r>
     </w:p>
     <w:p>
@@ -14386,7 +13603,6 @@
         <w:t>/chat.css): hidden state is </w:t>
       </w:r>
       <w:proofErr w:type="spellStart"/>
-      <w:proofErr w:type="gramStart"/>
       <w:r>
         <w:rPr>
           <w:rFonts w:eastAsia="Times New Roman"/>
@@ -14400,18 +13616,9 @@
           <w:rFonts w:eastAsia="Times New Roman"/>
           <w:color w:val="auto"/>
         </w:rPr>
-        <w:t>(</w:t>
-      </w:r>
-      <w:proofErr w:type="gramEnd"/>
-      <w:r>
-        <w:rPr>
-          <w:rFonts w:eastAsia="Times New Roman"/>
-          <w:color w:val="auto"/>
-        </w:rPr>
-        <w:t>100%), sliding to </w:t>
+        <w:t>(100%), sliding to </w:t>
       </w:r>
       <w:proofErr w:type="spellStart"/>
-      <w:proofErr w:type="gramStart"/>
       <w:r>
         <w:rPr>
           <w:rFonts w:eastAsia="Times New Roman"/>
@@ -14425,15 +13632,7 @@
           <w:rFonts w:eastAsia="Times New Roman"/>
           <w:color w:val="auto"/>
         </w:rPr>
-        <w:t>(</w:t>
-      </w:r>
-      <w:proofErr w:type="gramEnd"/>
-      <w:r>
-        <w:rPr>
-          <w:rFonts w:eastAsia="Times New Roman"/>
-          <w:color w:val="auto"/>
-        </w:rPr>
-        <w:t>0) over a 0.22s transition — deliberately mirroring the same slide-in pattern used by the app sidebar, per the CSS file's own comment.</w:t>
+        <w:t>(0) over a 0.22s transition — deliberately mirroring the same slide-in pattern used by the app sidebar, per the CSS file's own comment.</w:t>
       </w:r>
     </w:p>
     <w:p>
@@ -14449,7 +13648,6 @@
         </w:rPr>
       </w:pPr>
       <w:proofErr w:type="spellStart"/>
-      <w:proofErr w:type="gramStart"/>
       <w:r>
         <w:rPr>
           <w:rFonts w:eastAsia="Times New Roman"/>
@@ -14463,34 +13661,9 @@
           <w:rFonts w:eastAsia="Times New Roman"/>
           <w:color w:val="auto"/>
         </w:rPr>
-        <w:t>(</w:t>
-      </w:r>
-      <w:proofErr w:type="gramEnd"/>
-      <w:r>
-        <w:rPr>
-          <w:rFonts w:eastAsia="Times New Roman"/>
-          <w:color w:val="auto"/>
-        </w:rPr>
-        <w:t xml:space="preserve">) (in viewerShell.js) </w:t>
-      </w:r>
-      <w:proofErr w:type="gramStart"/>
-      <w:r>
-        <w:rPr>
-          <w:rFonts w:eastAsia="Times New Roman"/>
-          <w:color w:val="auto"/>
-        </w:rPr>
-        <w:t>lazy-imports</w:t>
-      </w:r>
-      <w:proofErr w:type="gramEnd"/>
-      <w:r>
-        <w:rPr>
-          <w:rFonts w:eastAsia="Times New Roman"/>
-          <w:color w:val="auto"/>
-        </w:rPr>
-        <w:t xml:space="preserve"> versionHistory.js and calls </w:t>
+        <w:t xml:space="preserve">() (in viewerShell.js) lazy-imports versionHistory.js and calls </w:t>
       </w:r>
       <w:proofErr w:type="spellStart"/>
-      <w:proofErr w:type="gramStart"/>
       <w:r>
         <w:rPr>
           <w:rFonts w:eastAsia="Times New Roman"/>
@@ -14504,15 +13677,7 @@
           <w:rFonts w:eastAsia="Times New Roman"/>
           <w:color w:val="auto"/>
         </w:rPr>
-        <w:t>(</w:t>
-      </w:r>
-      <w:proofErr w:type="gramEnd"/>
-      <w:r>
-        <w:rPr>
-          <w:rFonts w:eastAsia="Times New Roman"/>
-          <w:color w:val="auto"/>
-        </w:rPr>
-        <w:t xml:space="preserve">) when </w:t>
+        <w:t xml:space="preserve">() when </w:t>
       </w:r>
       <w:proofErr w:type="spellStart"/>
       <w:r>
@@ -15845,23 +15010,7 @@
           <w:rFonts w:eastAsia="Times New Roman"/>
           <w:color w:val="auto"/>
         </w:rPr>
-        <w:t xml:space="preserve"> (</w:t>
-      </w:r>
-      <w:proofErr w:type="gramStart"/>
-      <w:r>
-        <w:rPr>
-          <w:rFonts w:eastAsia="Times New Roman"/>
-          <w:color w:val="auto"/>
-        </w:rPr>
-        <w:t>login(</w:t>
-      </w:r>
-      <w:proofErr w:type="gramEnd"/>
-      <w:r>
-        <w:rPr>
-          <w:rFonts w:eastAsia="Times New Roman"/>
-          <w:color w:val="auto"/>
-        </w:rPr>
-        <w:t>): rejects empty username/password; surfaces "login failed" on invalid credentials; redirects and stores user info on success; surfaces an error on fetch failure).</w:t>
+        <w:t xml:space="preserve"> (login(): rejects empty username/password; surfaces "login failed" on invalid credentials; redirects and stores user info on success; surfaces an error on fetch failure).</w:t>
       </w:r>
     </w:p>
     <w:p>
@@ -16517,23 +15666,7 @@
           <w:rFonts w:eastAsia="Times New Roman"/>
           <w:color w:val="auto"/>
         </w:rPr>
-        <w:t xml:space="preserve"> switch updates both the </w:t>
-      </w:r>
-      <w:proofErr w:type="gramStart"/>
-      <w:r>
-        <w:rPr>
-          <w:rFonts w:eastAsia="Times New Roman"/>
-          <w:color w:val="auto"/>
-        </w:rPr>
-        <w:t>type</w:t>
-      </w:r>
-      <w:proofErr w:type="gramEnd"/>
-      <w:r>
-        <w:rPr>
-          <w:rFonts w:eastAsia="Times New Roman"/>
-          <w:color w:val="auto"/>
-        </w:rPr>
-        <w:t xml:space="preserve"> label and the connector geometry grid together (not just one or the other).</w:t>
+        <w:t xml:space="preserve"> switch updates both the type label and the connector geometry grid together (not just one or the other).</w:t>
       </w:r>
     </w:p>
     <w:p>
@@ -16578,23 +15711,7 @@
           <w:rFonts w:eastAsia="Times New Roman"/>
           <w:color w:val="auto"/>
         </w:rPr>
-        <w:t xml:space="preserve">: BAR </w:t>
-      </w:r>
-      <w:proofErr w:type="gramStart"/>
-      <w:r>
-        <w:rPr>
-          <w:rFonts w:eastAsia="Times New Roman"/>
-          <w:color w:val="auto"/>
-        </w:rPr>
-        <w:t>round-trips</w:t>
-      </w:r>
-      <w:proofErr w:type="gramEnd"/>
-      <w:r>
-        <w:rPr>
-          <w:rFonts w:eastAsia="Times New Roman"/>
-          <w:color w:val="auto"/>
-        </w:rPr>
-        <w:t xml:space="preserve"> to the desktop bar file; BAR→PLATE switch encodes the desktop plate file; loading a lingual PLATE creates exactly one plate-</w:t>
+        <w:t>: BAR round-trips to the desktop bar file; BAR→PLATE switch encodes the desktop plate file; loading a lingual PLATE creates exactly one plate-</w:t>
       </w:r>
       <w:proofErr w:type="spellStart"/>
       <w:r>
@@ -16860,42 +15977,9 @@
           <w:rFonts w:eastAsia="Times New Roman"/>
           <w:color w:val="auto"/>
         </w:rPr>
-        <w:t> — </w:t>
-      </w:r>
-      <w:proofErr w:type="gramStart"/>
-      <w:r>
-        <w:rPr>
-          <w:rFonts w:eastAsia="Times New Roman"/>
-          <w:color w:val="auto"/>
-        </w:rPr>
-        <w:t>showThreeDViewerQr(</w:t>
-      </w:r>
-      <w:proofErr w:type="gramEnd"/>
-      <w:r>
-        <w:rPr>
-          <w:rFonts w:eastAsia="Times New Roman"/>
-          <w:color w:val="auto"/>
-        </w:rPr>
-        <w:t>) / </w:t>
-      </w:r>
-      <w:proofErr w:type="gramStart"/>
-      <w:r>
-        <w:rPr>
-          <w:rFonts w:eastAsia="Times New Roman"/>
-          <w:color w:val="auto"/>
-        </w:rPr>
-        <w:t>buildThreeDViewerUrl(</w:t>
-      </w:r>
-      <w:proofErr w:type="gramEnd"/>
-      <w:r>
-        <w:rPr>
-          <w:rFonts w:eastAsia="Times New Roman"/>
-          <w:color w:val="auto"/>
-        </w:rPr>
-        <w:t>) (caseManagement.js): no automated Jest coverage — depends on </w:t>
+        <w:t> — showThreeDViewerQr() / buildThreeDViewerUrl() (caseManagement.js): no automated Jest coverage — depends on </w:t>
       </w:r>
       <w:proofErr w:type="spellStart"/>
-      <w:proofErr w:type="gramStart"/>
       <w:r>
         <w:rPr>
           <w:rFonts w:eastAsia="Times New Roman"/>
@@ -16904,7 +15988,6 @@
         <w:t>window.QRCode</w:t>
       </w:r>
       <w:proofErr w:type="spellEnd"/>
-      <w:proofErr w:type="gramEnd"/>
       <w:r>
         <w:rPr>
           <w:rFonts w:eastAsia="Times New Roman"/>
@@ -16969,7 +16052,6 @@
         <w:t xml:space="preserve"> test that stubs </w:t>
       </w:r>
       <w:proofErr w:type="spellStart"/>
-      <w:proofErr w:type="gramStart"/>
       <w:r>
         <w:rPr>
           <w:rFonts w:eastAsia="Times New Roman"/>
@@ -16978,7 +16060,6 @@
         <w:t>window.QRCode</w:t>
       </w:r>
       <w:proofErr w:type="spellEnd"/>
-      <w:proofErr w:type="gramEnd"/>
       <w:r>
         <w:rPr>
           <w:rFonts w:eastAsia="Times New Roman"/>
@@ -17015,6 +16096,9 @@
         <w:t>Report</w:t>
       </w:r>
       <w:bookmarkEnd w:id="33"/>
+      <w:r>
+        <w:t xml:space="preserve"> </w:t>
+      </w:r>
     </w:p>
     <w:p>
       <w:pPr>
@@ -17129,6 +16213,9 @@
       </w:pPr>
       <w:bookmarkStart w:id="35" w:name="_Toc234853099"/>
       <w:r>
+        <w:rPr>
+          <w:highlight w:val="yellow"/>
+        </w:rPr>
         <w:t>12.2 Test Cases</w:t>
       </w:r>
       <w:bookmarkEnd w:id="35"/>
@@ -17408,27 +16495,7 @@
                 <w:sz w:val="20"/>
                 <w:szCs w:val="20"/>
               </w:rPr>
-              <w:t xml:space="preserve">OTP fails to verify a correct code, or a </w:t>
-            </w:r>
-            <w:proofErr w:type="gramStart"/>
-            <w:r>
-              <w:rPr>
-                <w:rFonts w:eastAsia="Times New Roman"/>
-                <w:color w:val="auto"/>
-                <w:sz w:val="20"/>
-                <w:szCs w:val="20"/>
-              </w:rPr>
-              <w:t>page loads</w:t>
-            </w:r>
-            <w:proofErr w:type="gramEnd"/>
-            <w:r>
-              <w:rPr>
-                <w:rFonts w:eastAsia="Times New Roman"/>
-                <w:color w:val="auto"/>
-                <w:sz w:val="20"/>
-                <w:szCs w:val="20"/>
-              </w:rPr>
-              <w:t xml:space="preserve"> without </w:t>
+              <w:t>OTP fails to verify a correct code, or a page loads without </w:t>
             </w:r>
             <w:proofErr w:type="spellStart"/>
             <w:r>
@@ -17561,7 +16628,6 @@
               <w:t>Search/filter (</w:t>
             </w:r>
             <w:proofErr w:type="spellStart"/>
-            <w:proofErr w:type="gramStart"/>
             <w:r>
               <w:rPr>
                 <w:rFonts w:eastAsia="Times New Roman"/>
@@ -17579,20 +16645,9 @@
                 <w:sz w:val="20"/>
                 <w:szCs w:val="20"/>
               </w:rPr>
-              <w:t>(</w:t>
-            </w:r>
-            <w:proofErr w:type="gramEnd"/>
-            <w:r>
-              <w:rPr>
-                <w:rFonts w:eastAsia="Times New Roman"/>
-                <w:color w:val="auto"/>
-                <w:sz w:val="20"/>
-                <w:szCs w:val="20"/>
-              </w:rPr>
-              <w:t>)) and sort return correct results; inline status change (</w:t>
+              <w:t>()) and sort return correct results; inline status change (</w:t>
             </w:r>
             <w:proofErr w:type="spellStart"/>
-            <w:proofErr w:type="gramStart"/>
             <w:r>
               <w:rPr>
                 <w:rFonts w:eastAsia="Times New Roman"/>
@@ -17610,17 +16665,7 @@
                 <w:sz w:val="20"/>
                 <w:szCs w:val="20"/>
               </w:rPr>
-              <w:t>(</w:t>
-            </w:r>
-            <w:proofErr w:type="gramEnd"/>
-            <w:r>
-              <w:rPr>
-                <w:rFonts w:eastAsia="Times New Roman"/>
-                <w:color w:val="auto"/>
-                <w:sz w:val="20"/>
-                <w:szCs w:val="20"/>
-              </w:rPr>
-              <w:t>)) persists; duplicate/rename/delete/open all operate on the correct case.</w:t>
+              <w:t>()) persists; duplicate/rename/delete/open all operate on the correct case.</w:t>
             </w:r>
           </w:p>
         </w:tc>
@@ -17647,27 +16692,7 @@
                 <w:sz w:val="20"/>
                 <w:szCs w:val="20"/>
               </w:rPr>
-              <w:t xml:space="preserve">Filter/sort returns stale or wrong results; status change doesn't persist after </w:t>
-            </w:r>
-            <w:proofErr w:type="gramStart"/>
-            <w:r>
-              <w:rPr>
-                <w:rFonts w:eastAsia="Times New Roman"/>
-                <w:color w:val="auto"/>
-                <w:sz w:val="20"/>
-                <w:szCs w:val="20"/>
-              </w:rPr>
-              <w:t>reload</w:t>
-            </w:r>
-            <w:proofErr w:type="gramEnd"/>
-            <w:r>
-              <w:rPr>
-                <w:rFonts w:eastAsia="Times New Roman"/>
-                <w:color w:val="auto"/>
-                <w:sz w:val="20"/>
-                <w:szCs w:val="20"/>
-              </w:rPr>
-              <w:t>; delete/duplicate acts on the wrong case ID.</w:t>
+              <w:t>Filter/sort returns stale or wrong results; status change doesn't persist after reload; delete/duplicate acts on the wrong case ID.</w:t>
             </w:r>
           </w:p>
         </w:tc>
@@ -17793,7 +16818,6 @@
               <w:t>, </w:t>
             </w:r>
             <w:proofErr w:type="spellStart"/>
-            <w:proofErr w:type="gramStart"/>
             <w:r>
               <w:rPr>
                 <w:rFonts w:eastAsia="Times New Roman"/>
@@ -17811,17 +16835,7 @@
                 <w:sz w:val="20"/>
                 <w:szCs w:val="20"/>
               </w:rPr>
-              <w:t>(</w:t>
-            </w:r>
-            <w:proofErr w:type="gramEnd"/>
-            <w:r>
-              <w:rPr>
-                <w:rFonts w:eastAsia="Times New Roman"/>
-                <w:color w:val="auto"/>
-                <w:sz w:val="20"/>
-                <w:szCs w:val="20"/>
-              </w:rPr>
-              <w:t>)) receive access; case appears in Case List immediately.</w:t>
+              <w:t>()) receive access; case appears in Case List immediately.</w:t>
             </w:r>
           </w:p>
         </w:tc>
@@ -17945,7 +16959,6 @@
               <w:t>Per-case overview opens as an overlay (</w:t>
             </w:r>
             <w:proofErr w:type="spellStart"/>
-            <w:proofErr w:type="gramStart"/>
             <w:r>
               <w:rPr>
                 <w:rFonts w:eastAsia="Times New Roman"/>
@@ -17963,20 +16976,9 @@
                 <w:sz w:val="20"/>
                 <w:szCs w:val="20"/>
               </w:rPr>
-              <w:t>(</w:t>
-            </w:r>
-            <w:proofErr w:type="gramEnd"/>
-            <w:r>
-              <w:rPr>
-                <w:rFonts w:eastAsia="Times New Roman"/>
-                <w:color w:val="auto"/>
-                <w:sz w:val="20"/>
-                <w:szCs w:val="20"/>
-              </w:rPr>
-              <w:t>)) without navigating away; progress steps (</w:t>
+              <w:t>()) without navigating away; progress steps (</w:t>
             </w:r>
             <w:proofErr w:type="spellStart"/>
-            <w:proofErr w:type="gramStart"/>
             <w:r>
               <w:rPr>
                 <w:rFonts w:eastAsia="Times New Roman"/>
@@ -17994,20 +16996,9 @@
                 <w:sz w:val="20"/>
                 <w:szCs w:val="20"/>
               </w:rPr>
-              <w:t>(</w:t>
-            </w:r>
-            <w:proofErr w:type="gramEnd"/>
-            <w:r>
-              <w:rPr>
-                <w:rFonts w:eastAsia="Times New Roman"/>
-                <w:color w:val="auto"/>
-                <w:sz w:val="20"/>
-                <w:szCs w:val="20"/>
-              </w:rPr>
-              <w:t>), </w:t>
+              <w:t>(), </w:t>
             </w:r>
             <w:proofErr w:type="spellStart"/>
-            <w:proofErr w:type="gramStart"/>
             <w:r>
               <w:rPr>
                 <w:rFonts w:eastAsia="Times New Roman"/>
@@ -18025,20 +17016,9 @@
                 <w:sz w:val="20"/>
                 <w:szCs w:val="20"/>
               </w:rPr>
-              <w:t>(</w:t>
-            </w:r>
-            <w:proofErr w:type="gramEnd"/>
-            <w:r>
-              <w:rPr>
-                <w:rFonts w:eastAsia="Times New Roman"/>
-                <w:color w:val="auto"/>
-                <w:sz w:val="20"/>
-                <w:szCs w:val="20"/>
-              </w:rPr>
-              <w:t>)) and capture slots (</w:t>
+              <w:t>()) and capture slots (</w:t>
             </w:r>
             <w:proofErr w:type="spellStart"/>
-            <w:proofErr w:type="gramStart"/>
             <w:r>
               <w:rPr>
                 <w:rFonts w:eastAsia="Times New Roman"/>
@@ -18056,17 +17036,7 @@
                 <w:sz w:val="20"/>
                 <w:szCs w:val="20"/>
               </w:rPr>
-              <w:t>(</w:t>
-            </w:r>
-            <w:proofErr w:type="gramEnd"/>
-            <w:r>
-              <w:rPr>
-                <w:rFonts w:eastAsia="Times New Roman"/>
-                <w:color w:val="auto"/>
-                <w:sz w:val="20"/>
-                <w:szCs w:val="20"/>
-              </w:rPr>
-              <w:t>)) match the case's actual state.</w:t>
+              <w:t>()) match the case's actual state.</w:t>
             </w:r>
           </w:p>
         </w:tc>
@@ -18492,7 +17462,6 @@
               <w:t>From within 2D Annotation, jaw geometry, design overlays and artificial-teeth placement render correctly; undercut/occlusion modes toggle per-component; HD/SD mesh-quality toggle re-renders correctly (</w:t>
             </w:r>
             <w:proofErr w:type="spellStart"/>
-            <w:proofErr w:type="gramStart"/>
             <w:r>
               <w:rPr>
                 <w:rFonts w:eastAsia="Times New Roman"/>
@@ -18510,17 +17479,7 @@
                 <w:sz w:val="20"/>
                 <w:szCs w:val="20"/>
               </w:rPr>
-              <w:t>(</w:t>
-            </w:r>
-            <w:proofErr w:type="gramEnd"/>
-            <w:r>
-              <w:rPr>
-                <w:rFonts w:eastAsia="Times New Roman"/>
-                <w:color w:val="auto"/>
-                <w:sz w:val="20"/>
-                <w:szCs w:val="20"/>
-              </w:rPr>
-              <w:t>)) without leaving stale geometry.</w:t>
+              <w:t>()) without leaving stale geometry.</w:t>
             </w:r>
           </w:p>
         </w:tc>
@@ -18774,7 +17733,6 @@
               <w:t>Up to 4 extra reference STL slots (</w:t>
             </w:r>
             <w:proofErr w:type="spellStart"/>
-            <w:proofErr w:type="gramStart"/>
             <w:r>
               <w:rPr>
                 <w:rFonts w:eastAsia="Times New Roman"/>
@@ -18792,40 +17750,9 @@
                 <w:sz w:val="20"/>
                 <w:szCs w:val="20"/>
               </w:rPr>
-              <w:t>(</w:t>
-            </w:r>
-            <w:proofErr w:type="gramEnd"/>
-            <w:r>
-              <w:rPr>
-                <w:rFonts w:eastAsia="Times New Roman"/>
-                <w:color w:val="auto"/>
-                <w:sz w:val="20"/>
-                <w:szCs w:val="20"/>
-              </w:rPr>
-              <w:t>), jaw_stls_extra_slot_</w:t>
-            </w:r>
-            <w:proofErr w:type="gramStart"/>
-            <w:r>
-              <w:rPr>
-                <w:rFonts w:eastAsia="Times New Roman"/>
-                <w:color w:val="auto"/>
-                <w:sz w:val="20"/>
-                <w:szCs w:val="20"/>
-              </w:rPr>
-              <w:t>1..</w:t>
-            </w:r>
-            <w:proofErr w:type="gramEnd"/>
-            <w:r>
-              <w:rPr>
-                <w:rFonts w:eastAsia="Times New Roman"/>
-                <w:color w:val="auto"/>
-                <w:sz w:val="20"/>
-                <w:szCs w:val="20"/>
-              </w:rPr>
-              <w:t>4) upload, render, and can be shown/hidden (</w:t>
+              <w:t>(), jaw_stls_extra_slot_1..4) upload, render, and can be shown/hidden (</w:t>
             </w:r>
             <w:proofErr w:type="spellStart"/>
-            <w:proofErr w:type="gramStart"/>
             <w:r>
               <w:rPr>
                 <w:rFonts w:eastAsia="Times New Roman"/>
@@ -18843,20 +17770,9 @@
                 <w:sz w:val="20"/>
                 <w:szCs w:val="20"/>
               </w:rPr>
-              <w:t>(</w:t>
-            </w:r>
-            <w:proofErr w:type="gramEnd"/>
-            <w:r>
-              <w:rPr>
-                <w:rFonts w:eastAsia="Times New Roman"/>
-                <w:color w:val="auto"/>
-                <w:sz w:val="20"/>
-                <w:szCs w:val="20"/>
-              </w:rPr>
-              <w:t>)) and deleted (</w:t>
+              <w:t>()) and deleted (</w:t>
             </w:r>
             <w:proofErr w:type="spellStart"/>
-            <w:proofErr w:type="gramStart"/>
             <w:r>
               <w:rPr>
                 <w:rFonts w:eastAsia="Times New Roman"/>
@@ -18874,17 +17790,7 @@
                 <w:sz w:val="20"/>
                 <w:szCs w:val="20"/>
               </w:rPr>
-              <w:t>(</w:t>
-            </w:r>
-            <w:proofErr w:type="gramEnd"/>
-            <w:r>
-              <w:rPr>
-                <w:rFonts w:eastAsia="Times New Roman"/>
-                <w:color w:val="auto"/>
-                <w:sz w:val="20"/>
-                <w:szCs w:val="20"/>
-              </w:rPr>
-              <w:t>)) independently of each other and of the main jaw meshes.</w:t>
+              <w:t>()) independently of each other and of the main jaw meshes.</w:t>
             </w:r>
           </w:p>
         </w:tc>
@@ -19160,7 +18066,6 @@
               <w:t>Raw OFF/STL files download correctly (</w:t>
             </w:r>
             <w:proofErr w:type="spellStart"/>
-            <w:proofErr w:type="gramStart"/>
             <w:r>
               <w:rPr>
                 <w:rFonts w:eastAsia="Times New Roman"/>
@@ -19178,17 +18083,7 @@
                 <w:sz w:val="20"/>
                 <w:szCs w:val="20"/>
               </w:rPr>
-              <w:t>(</w:t>
-            </w:r>
-            <w:proofErr w:type="gramEnd"/>
-            <w:r>
-              <w:rPr>
-                <w:rFonts w:eastAsia="Times New Roman"/>
-                <w:color w:val="auto"/>
-                <w:sz w:val="20"/>
-                <w:szCs w:val="20"/>
-              </w:rPr>
-              <w:t>)); compiled .docx report generates correctly (</w:t>
+              <w:t>()); compiled .docx report generates correctly (</w:t>
             </w:r>
             <w:proofErr w:type="spellStart"/>
             <w:r>
@@ -19211,7 +18106,6 @@
               <w:t>()/</w:t>
             </w:r>
             <w:proofErr w:type="spellStart"/>
-            <w:proofErr w:type="gramStart"/>
             <w:r>
               <w:rPr>
                 <w:rFonts w:eastAsia="Times New Roman"/>
@@ -19229,20 +18123,9 @@
                 <w:sz w:val="20"/>
                 <w:szCs w:val="20"/>
               </w:rPr>
-              <w:t>(</w:t>
-            </w:r>
-            <w:proofErr w:type="gramEnd"/>
-            <w:r>
-              <w:rPr>
-                <w:rFonts w:eastAsia="Times New Roman"/>
-                <w:color w:val="auto"/>
-                <w:sz w:val="20"/>
-                <w:szCs w:val="20"/>
-              </w:rPr>
-              <w:t>), </w:t>
+              <w:t>(), </w:t>
             </w:r>
             <w:proofErr w:type="spellStart"/>
-            <w:proofErr w:type="gramStart"/>
             <w:r>
               <w:rPr>
                 <w:rFonts w:eastAsia="Times New Roman"/>
@@ -19260,40 +18143,9 @@
                 <w:sz w:val="20"/>
                 <w:szCs w:val="20"/>
               </w:rPr>
-              <w:t>(</w:t>
-            </w:r>
-            <w:proofErr w:type="gramEnd"/>
-            <w:r>
-              <w:rPr>
-                <w:rFonts w:eastAsia="Times New Roman"/>
-                <w:color w:val="auto"/>
-                <w:sz w:val="20"/>
-                <w:szCs w:val="20"/>
-              </w:rPr>
-              <w:t xml:space="preserve">)); the 3D viewer share link works under the shared VIEWER_UUID with the case ID correctly obfuscated (crypt.js </w:t>
-            </w:r>
-            <w:proofErr w:type="gramStart"/>
-            <w:r>
-              <w:rPr>
-                <w:rFonts w:eastAsia="Times New Roman"/>
-                <w:color w:val="auto"/>
-                <w:sz w:val="20"/>
-                <w:szCs w:val="20"/>
-              </w:rPr>
-              <w:t>lol(</w:t>
-            </w:r>
-            <w:proofErr w:type="gramEnd"/>
-            <w:r>
-              <w:rPr>
-                <w:rFonts w:eastAsia="Times New Roman"/>
-                <w:color w:val="auto"/>
-                <w:sz w:val="20"/>
-                <w:szCs w:val="20"/>
-              </w:rPr>
-              <w:t>)); the QR code (</w:t>
+              <w:t>()); the 3D viewer share link works under the shared VIEWER_UUID with the case ID correctly obfuscated (crypt.js lol()); the QR code (</w:t>
             </w:r>
             <w:proofErr w:type="spellStart"/>
-            <w:proofErr w:type="gramStart"/>
             <w:r>
               <w:rPr>
                 <w:rFonts w:eastAsia="Times New Roman"/>
@@ -19311,17 +18163,7 @@
                 <w:sz w:val="20"/>
                 <w:szCs w:val="20"/>
               </w:rPr>
-              <w:t>(</w:t>
-            </w:r>
-            <w:proofErr w:type="gramEnd"/>
-            <w:r>
-              <w:rPr>
-                <w:rFonts w:eastAsia="Times New Roman"/>
-                <w:color w:val="auto"/>
-                <w:sz w:val="20"/>
-                <w:szCs w:val="20"/>
-              </w:rPr>
-              <w:t>)) scans and opens the same working link.</w:t>
+              <w:t>()) scans and opens the same working link.</w:t>
             </w:r>
           </w:p>
         </w:tc>
@@ -19999,27 +18841,7 @@
                 <w:sz w:val="20"/>
                 <w:szCs w:val="20"/>
               </w:rPr>
-              <w:t>authGuard.js, login.js, appSidebar.js, viewerShell.js, chat.js, notifications.js, versionHistory.js, crypt.js (</w:t>
-            </w:r>
-            <w:proofErr w:type="gramStart"/>
-            <w:r>
-              <w:rPr>
-                <w:rFonts w:eastAsia="Times New Roman"/>
-                <w:color w:val="auto"/>
-                <w:sz w:val="20"/>
-                <w:szCs w:val="20"/>
-              </w:rPr>
-              <w:t>lol(</w:t>
-            </w:r>
-            <w:proofErr w:type="gramEnd"/>
-            <w:r>
-              <w:rPr>
-                <w:rFonts w:eastAsia="Times New Roman"/>
-                <w:color w:val="auto"/>
-                <w:sz w:val="20"/>
-                <w:szCs w:val="20"/>
-              </w:rPr>
-              <w:t>) case-id obfuscation — shared by Case List's share-link/QR flow and viewer navigation).</w:t>
+              <w:t>authGuard.js, login.js, appSidebar.js, viewerShell.js, chat.js, notifications.js, versionHistory.js, crypt.js (lol() case-id obfuscation — shared by Case List's share-link/QR flow and viewer navigation).</w:t>
             </w:r>
           </w:p>
         </w:tc>
@@ -20361,7 +19183,6 @@
               <w:t>/index.js — Three.js scene, orthographic camera, mesh groups, polyline and artificial-teeth overlays; newControls.js — visibility, opacity, analysis modes; OFFLoader.js + STLMeshLoader.js — geometry parsers; control.js — </w:t>
             </w:r>
             <w:proofErr w:type="spellStart"/>
-            <w:proofErr w:type="gramStart"/>
             <w:r>
               <w:rPr>
                 <w:rFonts w:eastAsia="Times New Roman"/>
@@ -20379,17 +19200,7 @@
                 <w:sz w:val="20"/>
                 <w:szCs w:val="20"/>
               </w:rPr>
-              <w:t>(</w:t>
-            </w:r>
-            <w:proofErr w:type="gramEnd"/>
-            <w:r>
-              <w:rPr>
-                <w:rFonts w:eastAsia="Times New Roman"/>
-                <w:color w:val="auto"/>
-                <w:sz w:val="20"/>
-                <w:szCs w:val="20"/>
-              </w:rPr>
-              <w:t xml:space="preserve">), a </w:t>
+              <w:t xml:space="preserve">(), a </w:t>
             </w:r>
             <w:proofErr w:type="spellStart"/>
             <w:r>
@@ -20412,7 +19223,6 @@
               <w:t>-based visibility/transparency panel with its own mobile-device check (</w:t>
             </w:r>
             <w:proofErr w:type="spellStart"/>
-            <w:proofErr w:type="gramStart"/>
             <w:r>
               <w:rPr>
                 <w:rFonts w:eastAsia="Times New Roman"/>
@@ -20430,17 +19240,7 @@
                 <w:sz w:val="20"/>
                 <w:szCs w:val="20"/>
               </w:rPr>
-              <w:t>(</w:t>
-            </w:r>
-            <w:proofErr w:type="gramEnd"/>
-            <w:r>
-              <w:rPr>
-                <w:rFonts w:eastAsia="Times New Roman"/>
-                <w:color w:val="auto"/>
-                <w:sz w:val="20"/>
-                <w:szCs w:val="20"/>
-              </w:rPr>
-              <w:t>)), imported separately from newControls.js.</w:t>
+              <w:t>()), imported separately from newControls.js.</w:t>
             </w:r>
           </w:p>
         </w:tc>
@@ -20582,21 +19382,7 @@
         <w:rPr>
           <w:color w:val="auto"/>
         </w:rPr>
-        <w:t xml:space="preserve">A Data Flow diagram is included in the foot of this </w:t>
-      </w:r>
-      <w:proofErr w:type="gramStart"/>
-      <w:r>
-        <w:rPr>
-          <w:color w:val="auto"/>
-        </w:rPr>
-        <w:t>section,</w:t>
-      </w:r>
-      <w:proofErr w:type="gramEnd"/>
-      <w:r>
-        <w:rPr>
-          <w:color w:val="auto"/>
-        </w:rPr>
-        <w:t xml:space="preserve"> the Workflow Diagram is at the end of Section 3.</w:t>
+        <w:t>A Data Flow diagram is included in the foot of this section, the Workflow Diagram is at the end of Section 3.</w:t>
       </w:r>
     </w:p>
     <w:p>
@@ -21094,67 +19880,7 @@
                 <w:sz w:val="20"/>
                 <w:szCs w:val="20"/>
               </w:rPr>
-              <w:t>/get, POST /case</w:t>
-            </w:r>
-            <w:proofErr w:type="gramStart"/>
-            <w:r>
-              <w:rPr>
-                <w:rFonts w:eastAsia="Times New Roman"/>
-                <w:color w:val="auto"/>
-                <w:sz w:val="20"/>
-                <w:szCs w:val="20"/>
-              </w:rPr>
-              <w:t>/get/:</w:t>
-            </w:r>
-            <w:proofErr w:type="gramEnd"/>
-            <w:r>
-              <w:rPr>
-                <w:rFonts w:eastAsia="Times New Roman"/>
-                <w:color w:val="auto"/>
-                <w:sz w:val="20"/>
-                <w:szCs w:val="20"/>
-              </w:rPr>
-              <w:t>id, POST /case, PUT /case/:id, POST /case</w:t>
-            </w:r>
-            <w:proofErr w:type="gramStart"/>
-            <w:r>
-              <w:rPr>
-                <w:rFonts w:eastAsia="Times New Roman"/>
-                <w:color w:val="auto"/>
-                <w:sz w:val="20"/>
-                <w:szCs w:val="20"/>
-              </w:rPr>
-              <w:t>/delete/:</w:t>
-            </w:r>
-            <w:proofErr w:type="gramEnd"/>
-            <w:r>
-              <w:rPr>
-                <w:rFonts w:eastAsia="Times New Roman"/>
-                <w:color w:val="auto"/>
-                <w:sz w:val="20"/>
-                <w:szCs w:val="20"/>
-              </w:rPr>
-              <w:t>id, POST /case/duplicate, POST /case</w:t>
-            </w:r>
-            <w:proofErr w:type="gramStart"/>
-            <w:r>
-              <w:rPr>
-                <w:rFonts w:eastAsia="Times New Roman"/>
-                <w:color w:val="auto"/>
-                <w:sz w:val="20"/>
-                <w:szCs w:val="20"/>
-              </w:rPr>
-              <w:t>/rename/:</w:t>
-            </w:r>
-            <w:proofErr w:type="gramEnd"/>
-            <w:r>
-              <w:rPr>
-                <w:rFonts w:eastAsia="Times New Roman"/>
-                <w:color w:val="auto"/>
-                <w:sz w:val="20"/>
-                <w:szCs w:val="20"/>
-              </w:rPr>
-              <w:t>id</w:t>
+              <w:t>/get, POST /case/get/:id, POST /case, PUT /case/:id, POST /case/delete/:id, POST /case/duplicate, POST /case/rename/:id</w:t>
             </w:r>
           </w:p>
         </w:tc>
@@ -21576,27 +20302,7 @@
                 <w:sz w:val="20"/>
                 <w:szCs w:val="20"/>
               </w:rPr>
-              <w:t>/get</w:t>
-            </w:r>
-            <w:proofErr w:type="gramStart"/>
-            <w:r>
-              <w:rPr>
-                <w:rFonts w:eastAsia="Times New Roman"/>
-                <w:color w:val="auto"/>
-                <w:sz w:val="20"/>
-                <w:szCs w:val="20"/>
-              </w:rPr>
-              <w:t>/:type</w:t>
-            </w:r>
-            <w:proofErr w:type="gramEnd"/>
-            <w:r>
-              <w:rPr>
-                <w:rFonts w:eastAsia="Times New Roman"/>
-                <w:color w:val="auto"/>
-                <w:sz w:val="20"/>
-                <w:szCs w:val="20"/>
-              </w:rPr>
-              <w:t>, POST /</w:t>
+              <w:t>/get/:type, POST /</w:t>
             </w:r>
             <w:proofErr w:type="spellStart"/>
             <w:r>
@@ -21964,17 +20670,7 @@
                 <w:sz w:val="20"/>
                 <w:szCs w:val="20"/>
               </w:rPr>
-              <w:t>/get</w:t>
-            </w:r>
-            <w:proofErr w:type="gramStart"/>
-            <w:r>
-              <w:rPr>
-                <w:rFonts w:eastAsia="Times New Roman"/>
-                <w:color w:val="auto"/>
-                <w:sz w:val="20"/>
-                <w:szCs w:val="20"/>
-              </w:rPr>
-              <w:t>/:</w:t>
+              <w:t>/get/:</w:t>
             </w:r>
             <w:proofErr w:type="spellStart"/>
             <w:r>
@@ -21987,7 +20683,6 @@
               <w:t>caseId</w:t>
             </w:r>
             <w:proofErr w:type="spellEnd"/>
-            <w:proofErr w:type="gramEnd"/>
             <w:r>
               <w:rPr>
                 <w:rFonts w:eastAsia="Times New Roman"/>
@@ -22274,17 +20969,7 @@
                 <w:sz w:val="20"/>
                 <w:szCs w:val="20"/>
               </w:rPr>
-              <w:t>POST /notes/get</w:t>
-            </w:r>
-            <w:proofErr w:type="gramStart"/>
-            <w:r>
-              <w:rPr>
-                <w:rFonts w:eastAsia="Times New Roman"/>
-                <w:color w:val="auto"/>
-                <w:sz w:val="20"/>
-                <w:szCs w:val="20"/>
-              </w:rPr>
-              <w:t>/:</w:t>
+              <w:t>POST /notes/get/:</w:t>
             </w:r>
             <w:proofErr w:type="spellStart"/>
             <w:r>
@@ -22297,7 +20982,6 @@
               <w:t>caseId</w:t>
             </w:r>
             <w:proofErr w:type="spellEnd"/>
-            <w:proofErr w:type="gramEnd"/>
             <w:r>
               <w:rPr>
                 <w:rFonts w:eastAsia="Times New Roman"/>
@@ -22710,65 +21394,14 @@
                 <w:szCs w:val="20"/>
               </w:rPr>
             </w:pPr>
-            <w:proofErr w:type="gramStart"/>
-            <w:r>
-              <w:rPr>
-                <w:rFonts w:eastAsia="Times New Roman"/>
-                <w:color w:val="auto"/>
-                <w:sz w:val="20"/>
-                <w:szCs w:val="20"/>
-              </w:rPr>
-              <w:t>1..*</w:t>
-            </w:r>
-            <w:proofErr w:type="gramEnd"/>
-            <w:r>
-              <w:rPr>
-                <w:rFonts w:eastAsia="Times New Roman"/>
-                <w:color w:val="auto"/>
-                <w:sz w:val="20"/>
-                <w:szCs w:val="20"/>
-              </w:rPr>
-              <w:t xml:space="preserve"> → Role; </w:t>
-            </w:r>
-            <w:proofErr w:type="gramStart"/>
-            <w:r>
-              <w:rPr>
-                <w:rFonts w:eastAsia="Times New Roman"/>
-                <w:color w:val="auto"/>
-                <w:sz w:val="20"/>
-                <w:szCs w:val="20"/>
-              </w:rPr>
-              <w:t>1..</w:t>
-            </w:r>
-            <w:proofErr w:type="gramEnd"/>
-            <w:r>
-              <w:rPr>
-                <w:rFonts w:eastAsia="Times New Roman"/>
-                <w:color w:val="auto"/>
-                <w:sz w:val="20"/>
-                <w:szCs w:val="20"/>
-              </w:rPr>
-              <w:t xml:space="preserve">* → Alert (sender/recipient); </w:t>
-            </w:r>
-            <w:proofErr w:type="gramStart"/>
-            <w:r>
-              <w:rPr>
-                <w:rFonts w:eastAsia="Times New Roman"/>
-                <w:color w:val="auto"/>
-                <w:sz w:val="20"/>
-                <w:szCs w:val="20"/>
-              </w:rPr>
-              <w:t>1..</w:t>
-            </w:r>
-            <w:proofErr w:type="gramEnd"/>
-            <w:r>
-              <w:rPr>
-                <w:rFonts w:eastAsia="Times New Roman"/>
-                <w:color w:val="auto"/>
-                <w:sz w:val="20"/>
-                <w:szCs w:val="20"/>
-              </w:rPr>
-              <w:t>* → Note (sender)</w:t>
+            <w:r>
+              <w:rPr>
+                <w:rFonts w:eastAsia="Times New Roman"/>
+                <w:color w:val="auto"/>
+                <w:sz w:val="20"/>
+                <w:szCs w:val="20"/>
+              </w:rPr>
+              <w:t>1..* → Role; 1..* → Alert (sender/recipient); 1..* → Note (sender)</w:t>
             </w:r>
           </w:p>
         </w:tc>
@@ -22918,25 +21551,14 @@
                 <w:szCs w:val="20"/>
               </w:rPr>
             </w:pPr>
-            <w:proofErr w:type="gramStart"/>
-            <w:r>
-              <w:rPr>
-                <w:rFonts w:eastAsia="Times New Roman"/>
-                <w:color w:val="auto"/>
-                <w:sz w:val="20"/>
-                <w:szCs w:val="20"/>
-              </w:rPr>
-              <w:t>1..*</w:t>
-            </w:r>
-            <w:proofErr w:type="gramEnd"/>
-            <w:r>
-              <w:rPr>
-                <w:rFonts w:eastAsia="Times New Roman"/>
-                <w:color w:val="auto"/>
-                <w:sz w:val="20"/>
-                <w:szCs w:val="20"/>
-              </w:rPr>
-              <w:t xml:space="preserve"> → Role, </w:t>
+            <w:r>
+              <w:rPr>
+                <w:rFonts w:eastAsia="Times New Roman"/>
+                <w:color w:val="auto"/>
+                <w:sz w:val="20"/>
+                <w:szCs w:val="20"/>
+              </w:rPr>
+              <w:t xml:space="preserve">1..* → Role, </w:t>
             </w:r>
             <w:proofErr w:type="spellStart"/>
             <w:r>
@@ -25023,23 +23645,7 @@
           <w:rFonts w:eastAsia="Times New Roman"/>
           <w:color w:val="auto"/>
         </w:rPr>
-        <w:t xml:space="preserve"> as interchangeable risks a link that decodes to the wrong </w:t>
-      </w:r>
-      <w:proofErr w:type="gramStart"/>
-      <w:r>
-        <w:rPr>
-          <w:rFonts w:eastAsia="Times New Roman"/>
-          <w:color w:val="auto"/>
-        </w:rPr>
-        <w:t>case, or</w:t>
-      </w:r>
-      <w:proofErr w:type="gramEnd"/>
-      <w:r>
-        <w:rPr>
-          <w:rFonts w:eastAsia="Times New Roman"/>
-          <w:color w:val="auto"/>
-        </w:rPr>
-        <w:t xml:space="preserve"> fails to decode at all.</w:t>
+        <w:t> as interchangeable risks a link that decodes to the wrong case, or fails to decode at all.</w:t>
       </w:r>
     </w:p>
     <w:p>
@@ -25232,23 +23838,7 @@
           <w:rFonts w:eastAsia="Times New Roman"/>
           <w:color w:val="auto"/>
         </w:rPr>
-        <w:t> jagged </w:t>
-      </w:r>
-      <w:proofErr w:type="gramStart"/>
-      <w:r>
-        <w:rPr>
-          <w:rFonts w:eastAsia="Times New Roman"/>
-          <w:color w:val="auto"/>
-        </w:rPr>
-        <w:t>byte[][</w:t>
-      </w:r>
-      <w:proofErr w:type="gramEnd"/>
-      <w:r>
-        <w:rPr>
-          <w:rFonts w:eastAsia="Times New Roman"/>
-          <w:color w:val="auto"/>
-        </w:rPr>
-        <w:t xml:space="preserve">] under .NET </w:t>
+        <w:t xml:space="preserve"> jagged byte[][] under .NET </w:t>
       </w:r>
       <w:proofErr w:type="spellStart"/>
       <w:r>
@@ -25432,7 +24022,6 @@
         <w:t xml:space="preserve"> </w:t>
       </w:r>
       <w:proofErr w:type="spellStart"/>
-      <w:proofErr w:type="gramStart"/>
       <w:r>
         <w:rPr>
           <w:rFonts w:eastAsia="Times New Roman"/>
@@ -25446,31 +24035,7 @@
           <w:rFonts w:eastAsia="Times New Roman"/>
           <w:color w:val="auto"/>
         </w:rPr>
-        <w:t>(</w:t>
-      </w:r>
-      <w:proofErr w:type="gramEnd"/>
-      <w:r>
-        <w:rPr>
-          <w:rFonts w:eastAsia="Times New Roman"/>
-          <w:color w:val="auto"/>
-        </w:rPr>
-        <w:t xml:space="preserve">)) </w:t>
-      </w:r>
-      <w:proofErr w:type="gramStart"/>
-      <w:r>
-        <w:rPr>
-          <w:rFonts w:eastAsia="Times New Roman"/>
-          <w:color w:val="auto"/>
-        </w:rPr>
-        <w:t>has to</w:t>
-      </w:r>
-      <w:proofErr w:type="gramEnd"/>
-      <w:r>
-        <w:rPr>
-          <w:rFonts w:eastAsia="Times New Roman"/>
-          <w:color w:val="auto"/>
-        </w:rPr>
-        <w:t xml:space="preserve"> keep in sync with.</w:t>
+        <w:t>()) has to keep in sync with.</w:t>
       </w:r>
     </w:p>
     <w:p>
@@ -25586,23 +24151,7 @@
           <w:rFonts w:eastAsia="Times New Roman"/>
           <w:color w:val="auto"/>
         </w:rPr>
-        <w:t xml:space="preserve">, Noticeboard). Three different codecs across the schema </w:t>
-      </w:r>
-      <w:proofErr w:type="gramStart"/>
-      <w:r>
-        <w:rPr>
-          <w:rFonts w:eastAsia="Times New Roman"/>
-          <w:color w:val="auto"/>
-        </w:rPr>
-        <w:t>is</w:t>
-      </w:r>
-      <w:proofErr w:type="gramEnd"/>
-      <w:r>
-        <w:rPr>
-          <w:rFonts w:eastAsia="Times New Roman"/>
-          <w:color w:val="auto"/>
-        </w:rPr>
-        <w:t xml:space="preserve"> worth keeping in mind as its own risk surface, same spirit as point 7's </w:t>
+        <w:t xml:space="preserve">, Noticeboard). Three different codecs across the schema is worth keeping in mind as its own risk surface, same spirit as point 7's </w:t>
       </w:r>
       <w:proofErr w:type="spellStart"/>
       <w:r>
@@ -26077,7 +24626,55 @@
         <w:rPr>
           <w:color w:val="auto"/>
         </w:rPr>
-        <w:t>UAT protocol with test case definitions</w:t>
+        <w:t xml:space="preserve">UAT </w:t>
+      </w:r>
+      <w:r>
+        <w:rPr>
+          <w:color w:val="auto"/>
+        </w:rPr>
+        <w:t>–</w:t>
+      </w:r>
+      <w:r>
+        <w:rPr>
+          <w:color w:val="auto"/>
+        </w:rPr>
+        <w:t xml:space="preserve"> </w:t>
+      </w:r>
+      <w:r>
+        <w:rPr>
+          <w:color w:val="auto"/>
+        </w:rPr>
+        <w:t>T</w:t>
+      </w:r>
+      <w:r>
+        <w:rPr>
+          <w:color w:val="auto"/>
+        </w:rPr>
+        <w:t xml:space="preserve">est </w:t>
+      </w:r>
+      <w:r>
+        <w:rPr>
+          <w:color w:val="auto"/>
+        </w:rPr>
+        <w:t>C</w:t>
+      </w:r>
+      <w:r>
+        <w:rPr>
+          <w:color w:val="auto"/>
+        </w:rPr>
+        <w:t xml:space="preserve">ase </w:t>
+      </w:r>
+      <w:r>
+        <w:rPr>
+          <w:color w:val="auto"/>
+        </w:rPr>
+        <w:t>D</w:t>
+      </w:r>
+      <w:r>
+        <w:rPr>
+          <w:color w:val="auto"/>
+        </w:rPr>
+        <w:t>efinitions</w:t>
       </w:r>
     </w:p>
     <w:p>
@@ -26196,7 +24793,19 @@
         <w:rPr>
           <w:color w:val="auto"/>
         </w:rPr>
-        <w:t>Pipeline &amp; Deployment Runbook</w:t>
+        <w:t xml:space="preserve">Pipeline </w:t>
+      </w:r>
+      <w:r>
+        <w:rPr>
+          <w:color w:val="auto"/>
+        </w:rPr>
+        <w:t xml:space="preserve">&amp; </w:t>
+      </w:r>
+      <w:r>
+        <w:rPr>
+          <w:color w:val="auto"/>
+        </w:rPr>
+        <w:t>Deployment Runbook</w:t>
       </w:r>
     </w:p>
     <w:p>
@@ -26215,13 +24824,25 @@
         <w:rPr>
           <w:color w:val="auto"/>
         </w:rPr>
-        <w:t>Recent commit history</w:t>
-      </w:r>
-      <w:r>
-        <w:rPr>
-          <w:color w:val="auto"/>
-        </w:rPr>
-        <w:t xml:space="preserve"> – live dev branch </w:t>
+        <w:t>Full</w:t>
+      </w:r>
+      <w:r>
+        <w:rPr>
+          <w:color w:val="auto"/>
+        </w:rPr>
+        <w:t xml:space="preserve"> commit history</w:t>
+      </w:r>
+      <w:r>
+        <w:rPr>
+          <w:color w:val="auto"/>
+        </w:rPr>
+        <w:t xml:space="preserve"> (.txt file)</w:t>
+      </w:r>
+      <w:r>
+        <w:rPr>
+          <w:color w:val="auto"/>
+        </w:rPr>
+        <w:t xml:space="preserve"> </w:t>
       </w:r>
     </w:p>
     <w:p>
@@ -26242,6 +24863,12 @@
         </w:rPr>
         <w:t>Data Dictionary</w:t>
       </w:r>
+      <w:r>
+        <w:rPr>
+          <w:color w:val="auto"/>
+        </w:rPr>
+        <w:t xml:space="preserve"> (.txt file)</w:t>
+      </w:r>
     </w:p>
     <w:p>
       <w:pPr>
@@ -26259,7 +24886,7 @@
         <w:rPr>
           <w:color w:val="auto"/>
         </w:rPr>
-        <w:t>Security posture and data privacy protocols</w:t>
+        <w:t>Traceability Report</w:t>
       </w:r>
     </w:p>
     <w:p>
@@ -26278,8 +24905,38 @@
         <w:rPr>
           <w:color w:val="auto"/>
         </w:rPr>
-        <w:t>Known issues and constraints backlog</w:t>
-      </w:r>
+        <w:t xml:space="preserve">UAT Report/Protocol </w:t>
+      </w:r>
+    </w:p>
+    <w:p>
+      <w:pPr>
+        <w:pStyle w:val="ListParagraph"/>
+        <w:numPr>
+          <w:ilvl w:val="0"/>
+          <w:numId w:val="2"/>
+        </w:numPr>
+        <w:spacing w:after="80" w:line="360" w:lineRule="auto"/>
+        <w:rPr>
+          <w:color w:val="auto"/>
+        </w:rPr>
+      </w:pPr>
+      <w:r>
+        <w:rPr>
+          <w:color w:val="auto"/>
+        </w:rPr>
+        <w:t xml:space="preserve">Feedback and Triage Report </w:t>
+      </w:r>
+    </w:p>
+    <w:p>
+      <w:pPr>
+        <w:pStyle w:val="ListParagraph"/>
+        <w:spacing w:after="80" w:line="360" w:lineRule="auto"/>
+        <w:ind w:left="720"/>
+        <w:rPr>
+          <w:color w:val="auto"/>
+          <w:highlight w:val="yellow"/>
+        </w:rPr>
+      </w:pPr>
     </w:p>
     <w:p>
       <w:pPr>

</xml_diff>